<commit_message>
Add Atencion en salas for dental/vet labs and manual DICOM upload.
Demo labs in seeder, DicomImportService, profile-based worklist UI, docs and instructivo updated.

Co-authored-by: Cursor <cursoragent@cursor.com>
</commit_message>
<xml_diff>
--- a/docs/INSTRUCTIVO_HealthTiCloud_RIS.docx
+++ b/docs/INSTRUCTIVO_HealthTiCloud_RIS.docx
@@ -203,7 +203,7 @@
         <w:ind w:left="283"/>
       </w:pPr>
       <w:r>
-        <w:t>5. Módulo Worklist (Tecnología)</w:t>
+        <w:t>5. Tecnología: Worklist y Atención en salas</w:t>
       </w:r>
     </w:p>
     <w:p>
@@ -558,7 +558,7 @@
               <w:rPr>
                 <w:sz w:val="20"/>
               </w:rPr>
-              <w:t>Atención en sala, insumos y envío DICOM al equipo.</w:t>
+              <w:t>Atención en sala con worklist DICOM (centros clínicos).</w:t>
             </w:r>
           </w:p>
         </w:tc>
@@ -601,6 +601,69 @@
               <w:rPr>
                 <w:sz w:val="20"/>
               </w:rPr>
+              <w:t>Atención en salas</w:t>
+            </w:r>
+          </w:p>
+        </w:tc>
+        <w:tc>
+          <w:tcPr>
+            <w:tcW w:type="dxa" w:w="3566"/>
+            <w:tcMar>
+              <w:top w:w="60" w:type="dxa"/>
+              <w:bottom w:w="60" w:type="dxa"/>
+              <w:start w:w="100" w:type="dxa"/>
+              <w:end w:w="100" w:type="dxa"/>
+            </w:tcMar>
+          </w:tcPr>
+          <w:p>
+            <w:r/>
+            <w:r>
+              <w:rPr>
+                <w:sz w:val="20"/>
+              </w:rPr>
+              <w:t>Atención técnica y subida manual de imágenes (dental / vet).</w:t>
+            </w:r>
+          </w:p>
+        </w:tc>
+        <w:tc>
+          <w:tcPr>
+            <w:tcW w:type="dxa" w:w="3963"/>
+            <w:tcMar>
+              <w:top w:w="60" w:type="dxa"/>
+              <w:bottom w:w="60" w:type="dxa"/>
+              <w:start w:w="100" w:type="dxa"/>
+              <w:end w:w="100" w:type="dxa"/>
+            </w:tcMar>
+          </w:tcPr>
+          <w:p>
+            <w:r/>
+            <w:r>
+              <w:rPr>
+                <w:sz w:val="20"/>
+              </w:rPr>
+              <w:t>Tecnólogo, Administrador</w:t>
+            </w:r>
+          </w:p>
+        </w:tc>
+      </w:tr>
+      <w:tr>
+        <w:tc>
+          <w:tcPr>
+            <w:tcW w:type="dxa" w:w="1882"/>
+            <w:shd w:fill="F8FCFB" w:val="clear"/>
+            <w:tcMar>
+              <w:top w:w="60" w:type="dxa"/>
+              <w:bottom w:w="60" w:type="dxa"/>
+              <w:start w:w="100" w:type="dxa"/>
+              <w:end w:w="100" w:type="dxa"/>
+            </w:tcMar>
+          </w:tcPr>
+          <w:p>
+            <w:r/>
+            <w:r>
+              <w:rPr>
+                <w:sz w:val="20"/>
+              </w:rPr>
               <w:t>Radiólogo</w:t>
             </w:r>
           </w:p>
@@ -608,6 +671,7 @@
         <w:tc>
           <w:tcPr>
             <w:tcW w:type="dxa" w:w="3566"/>
+            <w:shd w:fill="F8FCFB" w:val="clear"/>
             <w:tcMar>
               <w:top w:w="60" w:type="dxa"/>
               <w:bottom w:w="60" w:type="dxa"/>
@@ -628,6 +692,7 @@
         <w:tc>
           <w:tcPr>
             <w:tcW w:type="dxa" w:w="3963"/>
+            <w:shd w:fill="F8FCFB" w:val="clear"/>
             <w:tcMar>
               <w:top w:w="60" w:type="dxa"/>
               <w:bottom w:w="60" w:type="dxa"/>
@@ -650,7 +715,6 @@
         <w:tc>
           <w:tcPr>
             <w:tcW w:type="dxa" w:w="1882"/>
-            <w:shd w:fill="F8FCFB" w:val="clear"/>
             <w:tcMar>
               <w:top w:w="60" w:type="dxa"/>
               <w:bottom w:w="60" w:type="dxa"/>
@@ -671,7 +735,6 @@
         <w:tc>
           <w:tcPr>
             <w:tcW w:type="dxa" w:w="3566"/>
-            <w:shd w:fill="F8FCFB" w:val="clear"/>
             <w:tcMar>
               <w:top w:w="60" w:type="dxa"/>
               <w:bottom w:w="60" w:type="dxa"/>
@@ -692,7 +755,6 @@
         <w:tc>
           <w:tcPr>
             <w:tcW w:type="dxa" w:w="3963"/>
-            <w:shd w:fill="F8FCFB" w:val="clear"/>
             <w:tcMar>
               <w:top w:w="60" w:type="dxa"/>
               <w:bottom w:w="60" w:type="dxa"/>
@@ -715,6 +777,7 @@
         <w:tc>
           <w:tcPr>
             <w:tcW w:type="dxa" w:w="1882"/>
+            <w:shd w:fill="F8FCFB" w:val="clear"/>
             <w:tcMar>
               <w:top w:w="60" w:type="dxa"/>
               <w:bottom w:w="60" w:type="dxa"/>
@@ -735,6 +798,7 @@
         <w:tc>
           <w:tcPr>
             <w:tcW w:type="dxa" w:w="3566"/>
+            <w:shd w:fill="F8FCFB" w:val="clear"/>
             <w:tcMar>
               <w:top w:w="60" w:type="dxa"/>
               <w:bottom w:w="60" w:type="dxa"/>
@@ -755,6 +819,7 @@
         <w:tc>
           <w:tcPr>
             <w:tcW w:type="dxa" w:w="3963"/>
+            <w:shd w:fill="F8FCFB" w:val="clear"/>
             <w:tcMar>
               <w:top w:w="60" w:type="dxa"/>
               <w:bottom w:w="60" w:type="dxa"/>
@@ -777,7 +842,6 @@
         <w:tc>
           <w:tcPr>
             <w:tcW w:type="dxa" w:w="1882"/>
-            <w:shd w:fill="F8FCFB" w:val="clear"/>
             <w:tcMar>
               <w:top w:w="60" w:type="dxa"/>
               <w:bottom w:w="60" w:type="dxa"/>
@@ -798,7 +862,6 @@
         <w:tc>
           <w:tcPr>
             <w:tcW w:type="dxa" w:w="3566"/>
-            <w:shd w:fill="F8FCFB" w:val="clear"/>
             <w:tcMar>
               <w:top w:w="60" w:type="dxa"/>
               <w:bottom w:w="60" w:type="dxa"/>
@@ -819,7 +882,6 @@
         <w:tc>
           <w:tcPr>
             <w:tcW w:type="dxa" w:w="3963"/>
-            <w:shd w:fill="F8FCFB" w:val="clear"/>
             <w:tcMar>
               <w:top w:w="60" w:type="dxa"/>
               <w:bottom w:w="60" w:type="dxa"/>
@@ -842,6 +904,7 @@
         <w:tc>
           <w:tcPr>
             <w:tcW w:type="dxa" w:w="1882"/>
+            <w:shd w:fill="F8FCFB" w:val="clear"/>
             <w:tcMar>
               <w:top w:w="60" w:type="dxa"/>
               <w:bottom w:w="60" w:type="dxa"/>
@@ -862,6 +925,7 @@
         <w:tc>
           <w:tcPr>
             <w:tcW w:type="dxa" w:w="3566"/>
+            <w:shd w:fill="F8FCFB" w:val="clear"/>
             <w:tcMar>
               <w:top w:w="60" w:type="dxa"/>
               <w:bottom w:w="60" w:type="dxa"/>
@@ -882,6 +946,7 @@
         <w:tc>
           <w:tcPr>
             <w:tcW w:type="dxa" w:w="3963"/>
+            <w:shd w:fill="F8FCFB" w:val="clear"/>
             <w:tcMar>
               <w:top w:w="60" w:type="dxa"/>
               <w:bottom w:w="60" w:type="dxa"/>
@@ -904,7 +969,6 @@
         <w:tc>
           <w:tcPr>
             <w:tcW w:type="dxa" w:w="1882"/>
-            <w:shd w:fill="F8FCFB" w:val="clear"/>
             <w:tcMar>
               <w:top w:w="60" w:type="dxa"/>
               <w:bottom w:w="60" w:type="dxa"/>
@@ -925,7 +989,6 @@
         <w:tc>
           <w:tcPr>
             <w:tcW w:type="dxa" w:w="3566"/>
-            <w:shd w:fill="F8FCFB" w:val="clear"/>
             <w:tcMar>
               <w:top w:w="60" w:type="dxa"/>
               <w:bottom w:w="60" w:type="dxa"/>
@@ -946,7 +1009,6 @@
         <w:tc>
           <w:tcPr>
             <w:tcW w:type="dxa" w:w="3963"/>
-            <w:shd w:fill="F8FCFB" w:val="clear"/>
             <w:tcMar>
               <w:top w:w="60" w:type="dxa"/>
               <w:bottom w:w="60" w:type="dxa"/>
@@ -1075,7 +1137,7 @@
         <w:spacing w:after="60"/>
       </w:pPr>
       <w:r>
-        <w:t>Tecnología atiende en Worklist y envía la orden al equipo de imágenes.</w:t>
+        <w:t>Tecnología atiende en Worklist (clínico) o en Atención en salas (dental/vet) y deja las imágenes en PACS.</w:t>
       </w:r>
     </w:p>
     <w:p>
@@ -1277,7 +1339,7 @@
               <w:rPr>
                 <w:sz w:val="20"/>
               </w:rPr>
-              <w:t>DICOM enviado</w:t>
+              <w:t>DICOM enviado / imágenes en PACS</w:t>
             </w:r>
           </w:p>
         </w:tc>
@@ -1319,7 +1381,7 @@
               <w:rPr>
                 <w:sz w:val="20"/>
               </w:rPr>
-              <w:t>Worklist</w:t>
+              <w:t>Worklist o Atención en salas</w:t>
             </w:r>
           </w:p>
         </w:tc>
@@ -1657,7 +1719,7 @@
         <w:spacing w:after="60"/>
       </w:pPr>
       <w:r>
-        <w:t>Si es Tecnólogo, verá Worklist (y Dashboard si aplica).</w:t>
+        <w:t>Si es Tecnólogo en un centro clínico, verá Worklist; en dental o veterinario verá Atención en salas (no Worklist).</w:t>
       </w:r>
     </w:p>
     <w:p>
@@ -1924,7 +1986,7 @@
               <w:rPr>
                 <w:sz w:val="20"/>
               </w:rPr>
-              <w:t>tecnologo, admin</w:t>
+              <w:t>tecnologo, admin (solo centros con MWL)</w:t>
             </w:r>
           </w:p>
         </w:tc>
@@ -1946,6 +2008,49 @@
               <w:rPr>
                 <w:sz w:val="20"/>
               </w:rPr>
+              <w:t>Atención en salas</w:t>
+            </w:r>
+          </w:p>
+        </w:tc>
+        <w:tc>
+          <w:tcPr>
+            <w:tcW w:type="dxa" w:w="5944"/>
+            <w:tcMar>
+              <w:top w:w="60" w:type="dxa"/>
+              <w:bottom w:w="60" w:type="dxa"/>
+              <w:start w:w="100" w:type="dxa"/>
+              <w:end w:w="100" w:type="dxa"/>
+            </w:tcMar>
+          </w:tcPr>
+          <w:p>
+            <w:r/>
+            <w:r>
+              <w:rPr>
+                <w:sz w:val="20"/>
+              </w:rPr>
+              <w:t>tecnologo, admin (dental / veterinario / sin MWL)</w:t>
+            </w:r>
+          </w:p>
+        </w:tc>
+      </w:tr>
+      <w:tr>
+        <w:tc>
+          <w:tcPr>
+            <w:tcW w:type="dxa" w:w="3467"/>
+            <w:shd w:fill="F8FCFB" w:val="clear"/>
+            <w:tcMar>
+              <w:top w:w="60" w:type="dxa"/>
+              <w:bottom w:w="60" w:type="dxa"/>
+              <w:start w:w="100" w:type="dxa"/>
+              <w:end w:w="100" w:type="dxa"/>
+            </w:tcMar>
+          </w:tcPr>
+          <w:p>
+            <w:r/>
+            <w:r>
+              <w:rPr>
+                <w:sz w:val="20"/>
+              </w:rPr>
               <w:t>Radiólogo</w:t>
             </w:r>
           </w:p>
@@ -1953,6 +2058,7 @@
         <w:tc>
           <w:tcPr>
             <w:tcW w:type="dxa" w:w="5944"/>
+            <w:shd w:fill="F8FCFB" w:val="clear"/>
             <w:tcMar>
               <w:top w:w="60" w:type="dxa"/>
               <w:bottom w:w="60" w:type="dxa"/>
@@ -1975,7 +2081,6 @@
         <w:tc>
           <w:tcPr>
             <w:tcW w:type="dxa" w:w="3467"/>
-            <w:shd w:fill="F8FCFB" w:val="clear"/>
             <w:tcMar>
               <w:top w:w="60" w:type="dxa"/>
               <w:bottom w:w="60" w:type="dxa"/>
@@ -1996,7 +2101,6 @@
         <w:tc>
           <w:tcPr>
             <w:tcW w:type="dxa" w:w="5944"/>
-            <w:shd w:fill="F8FCFB" w:val="clear"/>
             <w:tcMar>
               <w:top w:w="60" w:type="dxa"/>
               <w:bottom w:w="60" w:type="dxa"/>
@@ -2019,6 +2123,7 @@
         <w:tc>
           <w:tcPr>
             <w:tcW w:type="dxa" w:w="3467"/>
+            <w:shd w:fill="F8FCFB" w:val="clear"/>
             <w:tcMar>
               <w:top w:w="60" w:type="dxa"/>
               <w:bottom w:w="60" w:type="dxa"/>
@@ -2039,6 +2144,7 @@
         <w:tc>
           <w:tcPr>
             <w:tcW w:type="dxa" w:w="5944"/>
+            <w:shd w:fill="F8FCFB" w:val="clear"/>
             <w:tcMar>
               <w:top w:w="60" w:type="dxa"/>
               <w:bottom w:w="60" w:type="dxa"/>
@@ -2061,7 +2167,6 @@
         <w:tc>
           <w:tcPr>
             <w:tcW w:type="dxa" w:w="3467"/>
-            <w:shd w:fill="F8FCFB" w:val="clear"/>
             <w:tcMar>
               <w:top w:w="60" w:type="dxa"/>
               <w:bottom w:w="60" w:type="dxa"/>
@@ -2082,7 +2187,6 @@
         <w:tc>
           <w:tcPr>
             <w:tcW w:type="dxa" w:w="5944"/>
-            <w:shd w:fill="F8FCFB" w:val="clear"/>
             <w:tcMar>
               <w:top w:w="60" w:type="dxa"/>
               <w:bottom w:w="60" w:type="dxa"/>
@@ -2105,6 +2209,7 @@
         <w:tc>
           <w:tcPr>
             <w:tcW w:type="dxa" w:w="3467"/>
+            <w:shd w:fill="F8FCFB" w:val="clear"/>
             <w:tcMar>
               <w:top w:w="60" w:type="dxa"/>
               <w:bottom w:w="60" w:type="dxa"/>
@@ -2125,6 +2230,7 @@
         <w:tc>
           <w:tcPr>
             <w:tcW w:type="dxa" w:w="5944"/>
+            <w:shd w:fill="F8FCFB" w:val="clear"/>
             <w:tcMar>
               <w:top w:w="60" w:type="dxa"/>
               <w:bottom w:w="60" w:type="dxa"/>
@@ -2147,7 +2253,6 @@
         <w:tc>
           <w:tcPr>
             <w:tcW w:type="dxa" w:w="3467"/>
-            <w:shd w:fill="F8FCFB" w:val="clear"/>
             <w:tcMar>
               <w:top w:w="60" w:type="dxa"/>
               <w:bottom w:w="60" w:type="dxa"/>
@@ -2168,7 +2273,6 @@
         <w:tc>
           <w:tcPr>
             <w:tcW w:type="dxa" w:w="5944"/>
-            <w:shd w:fill="F8FCFB" w:val="clear"/>
             <w:tcMar>
               <w:top w:w="60" w:type="dxa"/>
               <w:bottom w:w="60" w:type="dxa"/>
@@ -2355,6 +2459,15 @@
     </w:p>
     <w:p>
       <w:pPr>
+        <w:pStyle w:val="ListBullet"/>
+        <w:spacing w:after="60"/>
+      </w:pPr>
+      <w:r>
+        <w:t>Si la cita queda Confirmada y el centro es dental o veterinario, aparece un aviso con botón para ir al módulo Atención en salas.</w:t>
+      </w:r>
+    </w:p>
+    <w:p>
+      <w:pPr>
         <w:spacing w:before="80" w:after="40"/>
         <w:jc w:val="center"/>
       </w:pPr>
@@ -2544,7 +2657,7 @@
         <w:pStyle w:val="Heading1"/>
       </w:pPr>
       <w:r>
-        <w:t>5. Módulo Worklist (Tecnología)</w:t>
+        <w:t>5. Tecnología: Worklist y Atención en salas</w:t>
       </w:r>
     </w:p>
     <w:p>
@@ -2557,7 +2670,7 @@
           <w:b w:val="0"/>
           <w:i w:val="0"/>
         </w:rPr>
-        <w:t>Acceso: tecnólogos y administradores.</w:t>
+        <w:t>Acceso: tecnólogos y administradores. El menú muestra Worklist o Atención en salas según el tipo de laboratorio activo (no ambos a la vez).</w:t>
       </w:r>
     </w:p>
     <w:p>
@@ -2611,7 +2724,7 @@
           <w:color w:val="6C757D"/>
           <w:sz w:val="20"/>
         </w:rPr>
-        <w:t>Figura 6. Lista de pacientes en espera de atención técnica.</w:t>
+        <w:t>Figura 6. Lista de pacientes en espera de atención técnica (ejemplo Worklist).</w:t>
       </w:r>
     </w:p>
     <w:p>
@@ -2619,16 +2732,60 @@
         <w:pStyle w:val="Heading2"/>
       </w:pPr>
       <w:r>
-        <w:t>Qué puede hacer aquí</w:t>
+        <w:t>Flujo común (todos los centros)</w:t>
       </w:r>
     </w:p>
     <w:p>
       <w:pPr>
+        <w:pStyle w:val="ListNumber"/>
+        <w:spacing w:after="60"/>
+      </w:pPr>
+      <w:r>
+        <w:t>Recepción agenda y confirma la cita en el módulo Agenda.</w:t>
+      </w:r>
+    </w:p>
+    <w:p>
+      <w:pPr>
+        <w:pStyle w:val="ListNumber"/>
+        <w:spacing w:after="60"/>
+      </w:pPr>
+      <w:r>
+        <w:t>El tecnólogo abre la lista del día y pulsa Atender sobre el paciente.</w:t>
+      </w:r>
+    </w:p>
+    <w:p>
+      <w:pPr>
+        <w:pStyle w:val="ListNumber"/>
+        <w:spacing w:after="60"/>
+      </w:pPr>
+      <w:r>
+        <w:t>Registra anamnesis, insumos y deja las imágenes disponibles en PACS.</w:t>
+      </w:r>
+    </w:p>
+    <w:p>
+      <w:pPr>
+        <w:pStyle w:val="ListNumber"/>
+        <w:spacing w:after="60"/>
+      </w:pPr>
+      <w:r>
+        <w:t>Finaliza la atención para derivar el caso al radiólogo.</w:t>
+      </w:r>
+    </w:p>
+    <w:p>
+      <w:pPr>
+        <w:pStyle w:val="Heading2"/>
+      </w:pPr>
+      <w:r>
+        <w:t>Worklist — centros clínicos con MWL</w:t>
+      </w:r>
+    </w:p>
+    <w:p>
+      <w:pPr>
         <w:pStyle w:val="ListBullet"/>
         <w:spacing w:after="60"/>
       </w:pPr>
       <w:r>
-        <w:t>Ver pacientes confirmados o en atención, agrupados por cadena de estudios.</w:t>
+        <w:t>Ver pacientes confirmados, agrupados por cadena de estudios.</w:t>
       </w:r>
     </w:p>
     <w:p>
@@ -2646,7 +2803,7 @@
         <w:spacing w:after="60"/>
       </w:pPr>
       <w:r>
-        <w:t>Abrir el modal de Atención técnica para un paciente.</w:t>
+        <w:t>Crear accession y enviar la orden DICOM al equipo (worklist Orthanc).</w:t>
       </w:r>
     </w:p>
     <w:p>
@@ -2655,7 +2812,7 @@
         <w:spacing w:after="60"/>
       </w:pPr>
       <w:r>
-        <w:t>Revisar exámenes solicitados, datos clínicos e insumos.</w:t>
+        <w:t>El equipo adquiere el estudio; el estado pasa a «En modalidad».</w:t>
       </w:r>
     </w:p>
     <w:p>
@@ -2664,7 +2821,7 @@
         <w:spacing w:after="60"/>
       </w:pPr>
       <w:r>
-        <w:t>Registrar insumos consumidos durante la atención.</w:t>
+        <w:t>Completar la atención cuando las imágenes estén en PACS.</w:t>
       </w:r>
     </w:p>
     <w:p>
@@ -2673,25 +2830,28 @@
         <w:spacing w:after="60"/>
       </w:pPr>
       <w:r>
-        <w:t>Enviar la orden DICOM al equipo (PACS/Orthanc según configuración del centro).</w:t>
+        <w:t>Devolver a recepción con motivo si corresponde.</w:t>
       </w:r>
     </w:p>
     <w:p>
       <w:pPr>
-        <w:pStyle w:val="ListBullet"/>
-        <w:spacing w:after="60"/>
+        <w:pStyle w:val="Heading2"/>
       </w:pPr>
       <w:r>
-        <w:t>Confirmar que el estudio quedó disponible en el equipo.</w:t>
+        <w:t>Atención en salas — dental, veterinario o sin worklist</w:t>
       </w:r>
     </w:p>
     <w:p>
       <w:pPr>
-        <w:pStyle w:val="ListBullet"/>
-        <w:spacing w:after="60"/>
+        <w:spacing w:after="120"/>
+        <w:jc w:val="left"/>
       </w:pPr>
       <w:r>
-        <w:t>Completar la atención para que el caso pase al radiólogo.</w:t>
+        <w:rPr>
+          <w:b w:val="0"/>
+          <w:i w:val="0"/>
+        </w:rPr>
+        <w:t>Para CBCT, sensores intraorales u otros equipos que exportan DICOM por archivo (sin licencia MWL o sin integración worklist), use este módulo en lugar de Worklist.</w:t>
       </w:r>
     </w:p>
     <w:p>
@@ -2700,7 +2860,65 @@
         <w:spacing w:after="60"/>
       </w:pPr>
       <w:r>
-        <w:t>Devolver el paciente a recepción indicando motivo (preparación, documentación, etc.).</w:t>
+        <w:t>Misma lista de pacientes confirmados desde Agenda.</w:t>
+      </w:r>
+    </w:p>
+    <w:p>
+      <w:pPr>
+        <w:pStyle w:val="ListBullet"/>
+        <w:spacing w:after="60"/>
+      </w:pPr>
+      <w:r>
+        <w:t>En el modal de atención: subir archivo .dcm o .zip exportado del equipo.</w:t>
+      </w:r>
+    </w:p>
+    <w:p>
+      <w:pPr>
+        <w:pStyle w:val="ListBullet"/>
+        <w:spacing w:after="60"/>
+      </w:pPr>
+      <w:r>
+        <w:t>El sistema envía las imágenes a Orthanc y etiqueta RUT, nombre y accession de la cita.</w:t>
+      </w:r>
+    </w:p>
+    <w:p>
+      <w:pPr>
+        <w:pStyle w:val="ListBullet"/>
+        <w:spacing w:after="60"/>
+      </w:pPr>
+      <w:r>
+        <w:t>Estado «Imágenes en PACS» cuando la subida fue exitosa.</w:t>
+      </w:r>
+    </w:p>
+    <w:p>
+      <w:pPr>
+        <w:pStyle w:val="ListBullet"/>
+        <w:spacing w:after="60"/>
+      </w:pPr>
+      <w:r>
+        <w:t>Luego registre anamnesis e insumos y finalice hacia el radiólogo.</w:t>
+      </w:r>
+    </w:p>
+    <w:p>
+      <w:pPr>
+        <w:pStyle w:val="ListBullet"/>
+        <w:spacing w:after="60"/>
+      </w:pPr>
+      <w:r>
+        <w:t>En la barra superior seleccione el laboratorio dental o veterinario correcto antes de operar.</w:t>
+      </w:r>
+    </w:p>
+    <w:p>
+      <w:pPr>
+        <w:spacing w:after="120"/>
+        <w:jc w:val="left"/>
+      </w:pPr>
+      <w:r>
+        <w:rPr>
+          <w:b w:val="0"/>
+          <w:i w:val="0"/>
+        </w:rPr>
+        <w:t>Entornos de prueba tras db:seed incluyen «Dental Demo — CBCT Temuco», «Dental Demo — Sucursal Centro», «Veterinaria Demo Sur» y «Veterinaria Demo — Urgencias 24h». El usuario tecnólogo de prueba (friquelme) tiene acceso a esas sedes.</w:t>
       </w:r>
     </w:p>
     <w:p>
@@ -4162,7 +4380,175 @@
               <w:rPr>
                 <w:sz w:val="20"/>
               </w:rPr>
-              <w:t>Flujo Worklist → Informe → Entrega</w:t>
+              <w:t>Módulo de tecnología</w:t>
+            </w:r>
+          </w:p>
+        </w:tc>
+        <w:tc>
+          <w:tcPr>
+            <w:tcW w:type="dxa" w:w="2403"/>
+            <w:shd w:fill="F8FCFB" w:val="clear"/>
+            <w:tcMar>
+              <w:top w:w="60" w:type="dxa"/>
+              <w:bottom w:w="60" w:type="dxa"/>
+              <w:start w:w="100" w:type="dxa"/>
+              <w:end w:w="100" w:type="dxa"/>
+            </w:tcMar>
+          </w:tcPr>
+          <w:p>
+            <w:r/>
+            <w:r>
+              <w:rPr>
+                <w:sz w:val="20"/>
+              </w:rPr>
+              <w:t>Worklist (MWL)</w:t>
+            </w:r>
+          </w:p>
+        </w:tc>
+        <w:tc>
+          <w:tcPr>
+            <w:tcW w:type="dxa" w:w="2403"/>
+            <w:shd w:fill="F8FCFB" w:val="clear"/>
+            <w:tcMar>
+              <w:top w:w="60" w:type="dxa"/>
+              <w:bottom w:w="60" w:type="dxa"/>
+              <w:start w:w="100" w:type="dxa"/>
+              <w:end w:w="100" w:type="dxa"/>
+            </w:tcMar>
+          </w:tcPr>
+          <w:p>
+            <w:r/>
+            <w:r>
+              <w:rPr>
+                <w:sz w:val="20"/>
+              </w:rPr>
+              <w:t>Atención en salas</w:t>
+            </w:r>
+          </w:p>
+        </w:tc>
+        <w:tc>
+          <w:tcPr>
+            <w:tcW w:type="dxa" w:w="2503"/>
+            <w:shd w:fill="F8FCFB" w:val="clear"/>
+            <w:tcMar>
+              <w:top w:w="60" w:type="dxa"/>
+              <w:bottom w:w="60" w:type="dxa"/>
+              <w:start w:w="100" w:type="dxa"/>
+              <w:end w:w="100" w:type="dxa"/>
+            </w:tcMar>
+          </w:tcPr>
+          <w:p>
+            <w:r/>
+            <w:r>
+              <w:rPr>
+                <w:sz w:val="20"/>
+              </w:rPr>
+              <w:t>Atención en salas</w:t>
+            </w:r>
+          </w:p>
+        </w:tc>
+      </w:tr>
+      <w:tr>
+        <w:tc>
+          <w:tcPr>
+            <w:tcW w:type="dxa" w:w="2102"/>
+            <w:tcMar>
+              <w:top w:w="60" w:type="dxa"/>
+              <w:bottom w:w="60" w:type="dxa"/>
+              <w:start w:w="100" w:type="dxa"/>
+              <w:end w:w="100" w:type="dxa"/>
+            </w:tcMar>
+          </w:tcPr>
+          <w:p>
+            <w:r/>
+            <w:r>
+              <w:rPr>
+                <w:sz w:val="20"/>
+              </w:rPr>
+              <w:t>Subida de imágenes</w:t>
+            </w:r>
+          </w:p>
+        </w:tc>
+        <w:tc>
+          <w:tcPr>
+            <w:tcW w:type="dxa" w:w="2403"/>
+            <w:tcMar>
+              <w:top w:w="60" w:type="dxa"/>
+              <w:bottom w:w="60" w:type="dxa"/>
+              <w:start w:w="100" w:type="dxa"/>
+              <w:end w:w="100" w:type="dxa"/>
+            </w:tcMar>
+          </w:tcPr>
+          <w:p>
+            <w:r/>
+            <w:r>
+              <w:rPr>
+                <w:sz w:val="20"/>
+              </w:rPr>
+              <w:t>Equipo + worklist</w:t>
+            </w:r>
+          </w:p>
+        </w:tc>
+        <w:tc>
+          <w:tcPr>
+            <w:tcW w:type="dxa" w:w="2403"/>
+            <w:tcMar>
+              <w:top w:w="60" w:type="dxa"/>
+              <w:bottom w:w="60" w:type="dxa"/>
+              <w:start w:w="100" w:type="dxa"/>
+              <w:end w:w="100" w:type="dxa"/>
+            </w:tcMar>
+          </w:tcPr>
+          <w:p>
+            <w:r/>
+            <w:r>
+              <w:rPr>
+                <w:sz w:val="20"/>
+              </w:rPr>
+              <w:t>Archivo .dcm/.zip manual</w:t>
+            </w:r>
+          </w:p>
+        </w:tc>
+        <w:tc>
+          <w:tcPr>
+            <w:tcW w:type="dxa" w:w="2503"/>
+            <w:tcMar>
+              <w:top w:w="60" w:type="dxa"/>
+              <w:bottom w:w="60" w:type="dxa"/>
+              <w:start w:w="100" w:type="dxa"/>
+              <w:end w:w="100" w:type="dxa"/>
+            </w:tcMar>
+          </w:tcPr>
+          <w:p>
+            <w:r/>
+            <w:r>
+              <w:rPr>
+                <w:sz w:val="20"/>
+              </w:rPr>
+              <w:t>Archivo .dcm/.zip manual</w:t>
+            </w:r>
+          </w:p>
+        </w:tc>
+      </w:tr>
+      <w:tr>
+        <w:tc>
+          <w:tcPr>
+            <w:tcW w:type="dxa" w:w="2102"/>
+            <w:shd w:fill="F8FCFB" w:val="clear"/>
+            <w:tcMar>
+              <w:top w:w="60" w:type="dxa"/>
+              <w:bottom w:w="60" w:type="dxa"/>
+              <w:start w:w="100" w:type="dxa"/>
+              <w:end w:w="100" w:type="dxa"/>
+            </w:tcMar>
+          </w:tcPr>
+          <w:p>
+            <w:r/>
+            <w:r>
+              <w:rPr>
+                <w:sz w:val="20"/>
+              </w:rPr>
+              <w:t>Flujo → Informe → Entrega</w:t>
             </w:r>
           </w:p>
         </w:tc>
@@ -4321,7 +4707,7 @@
         <w:spacing w:after="60"/>
       </w:pPr>
       <w:r>
-        <w:t>Catálogo de exámenes e insumos se administra igual en Administración; use códigos internos o de convenio en lugar de arancel FONASA.</w:t>
+        <w:t>Flujo: Agenda (confirmar) → Atención en salas (subir DICOM) → Radiólogo → Entrega.</w:t>
       </w:r>
     </w:p>
     <w:p>
@@ -4330,7 +4716,25 @@
         <w:spacing w:after="60"/>
       </w:pPr>
       <w:r>
-        <w:t>Médico derivante y sala/equipo se configuran como en cualquier sede.</w:t>
+        <w:t>No aparece el menú Worklist; solo Atención en salas.</w:t>
+      </w:r>
+    </w:p>
+    <w:p>
+      <w:pPr>
+        <w:pStyle w:val="ListBullet"/>
+        <w:spacing w:after="60"/>
+      </w:pPr>
+      <w:r>
+        <w:t>Catálogo de exámenes e insumos se administra igual; use códigos de prestación internos.</w:t>
+      </w:r>
+    </w:p>
+    <w:p>
+      <w:pPr>
+        <w:pStyle w:val="ListBullet"/>
+        <w:spacing w:after="60"/>
+      </w:pPr>
+      <w:r>
+        <w:t>Médico derivante y sala/equipo (CBCT, sensor) se configuran en Administración.</w:t>
       </w:r>
     </w:p>
     <w:p>
@@ -4383,7 +4787,442 @@
         <w:spacing w:after="60"/>
       </w:pPr>
       <w:r>
-        <w:t>Worklist, radiólogo, transcripción, validación y entrega operan igual; el informe es del estudio veterinario.</w:t>
+        <w:t>Atención en salas, radiólogo, transcripción, validación y entrega operan igual que en clínico.</w:t>
+      </w:r>
+    </w:p>
+    <w:p>
+      <w:pPr>
+        <w:pStyle w:val="ListBullet"/>
+        <w:spacing w:after="60"/>
+      </w:pPr>
+      <w:r>
+        <w:t>Subida manual de imágenes cuando el equipo no usa worklist DICOM.</w:t>
+      </w:r>
+    </w:p>
+    <w:p>
+      <w:pPr>
+        <w:pStyle w:val="Heading2"/>
+      </w:pPr>
+      <w:r>
+        <w:t>Laboratorios de demostración (desarrollo)</w:t>
+      </w:r>
+    </w:p>
+    <w:tbl>
+      <w:tblPr>
+        <w:tblStyle w:val="TableGrid"/>
+        <w:tblW w:type="auto" w:w="0"/>
+        <w:tblLayout w:type="fixed"/>
+        <w:tblLook w:firstColumn="1" w:firstRow="1" w:lastColumn="0" w:lastRow="0" w:noHBand="0" w:noVBand="1" w:val="04A0"/>
+      </w:tblPr>
+      <w:tblGrid>
+        <w:gridCol w:w="3137"/>
+        <w:gridCol w:w="3137"/>
+        <w:gridCol w:w="3137"/>
+      </w:tblGrid>
+      <w:tr>
+        <w:tc>
+          <w:tcPr>
+            <w:tcW w:type="dxa" w:w="2873"/>
+            <w:shd w:fill="2EC4B6" w:val="clear"/>
+            <w:tcMar>
+              <w:top w:w="60" w:type="dxa"/>
+              <w:bottom w:w="60" w:type="dxa"/>
+              <w:start w:w="100" w:type="dxa"/>
+              <w:end w:w="100" w:type="dxa"/>
+            </w:tcMar>
+          </w:tcPr>
+          <w:p>
+            <w:r/>
+            <w:r>
+              <w:rPr>
+                <w:b/>
+                <w:color w:val="FFFFFF"/>
+                <w:sz w:val="20"/>
+              </w:rPr>
+              <w:t>Nombre en selector</w:t>
+            </w:r>
+          </w:p>
+        </w:tc>
+        <w:tc>
+          <w:tcPr>
+            <w:tcW w:type="dxa" w:w="1882"/>
+            <w:shd w:fill="2EC4B6" w:val="clear"/>
+            <w:tcMar>
+              <w:top w:w="60" w:type="dxa"/>
+              <w:bottom w:w="60" w:type="dxa"/>
+              <w:start w:w="100" w:type="dxa"/>
+              <w:end w:w="100" w:type="dxa"/>
+            </w:tcMar>
+          </w:tcPr>
+          <w:p>
+            <w:r/>
+            <w:r>
+              <w:rPr>
+                <w:b/>
+                <w:color w:val="FFFFFF"/>
+                <w:sz w:val="20"/>
+              </w:rPr>
+              <w:t>Tipo</w:t>
+            </w:r>
+          </w:p>
+        </w:tc>
+        <w:tc>
+          <w:tcPr>
+            <w:tcW w:type="dxa" w:w="4656"/>
+            <w:shd w:fill="2EC4B6" w:val="clear"/>
+            <w:tcMar>
+              <w:top w:w="60" w:type="dxa"/>
+              <w:bottom w:w="60" w:type="dxa"/>
+              <w:start w:w="100" w:type="dxa"/>
+              <w:end w:w="100" w:type="dxa"/>
+            </w:tcMar>
+          </w:tcPr>
+          <w:p>
+            <w:r/>
+            <w:r>
+              <w:rPr>
+                <w:b/>
+                <w:color w:val="FFFFFF"/>
+                <w:sz w:val="20"/>
+              </w:rPr>
+              <w:t>Uso</w:t>
+            </w:r>
+          </w:p>
+        </w:tc>
+      </w:tr>
+      <w:tr>
+        <w:tc>
+          <w:tcPr>
+            <w:tcW w:type="dxa" w:w="2873"/>
+            <w:tcMar>
+              <w:top w:w="60" w:type="dxa"/>
+              <w:bottom w:w="60" w:type="dxa"/>
+              <w:start w:w="100" w:type="dxa"/>
+              <w:end w:w="100" w:type="dxa"/>
+            </w:tcMar>
+          </w:tcPr>
+          <w:p>
+            <w:r/>
+            <w:r>
+              <w:rPr>
+                <w:sz w:val="20"/>
+              </w:rPr>
+              <w:t>Dental Demo — CBCT Temuco</w:t>
+            </w:r>
+          </w:p>
+        </w:tc>
+        <w:tc>
+          <w:tcPr>
+            <w:tcW w:type="dxa" w:w="1882"/>
+            <w:tcMar>
+              <w:top w:w="60" w:type="dxa"/>
+              <w:bottom w:w="60" w:type="dxa"/>
+              <w:start w:w="100" w:type="dxa"/>
+              <w:end w:w="100" w:type="dxa"/>
+            </w:tcMar>
+          </w:tcPr>
+          <w:p>
+            <w:r/>
+            <w:r>
+              <w:rPr>
+                <w:sz w:val="20"/>
+              </w:rPr>
+              <w:t>Centro Dental</w:t>
+            </w:r>
+          </w:p>
+        </w:tc>
+        <w:tc>
+          <w:tcPr>
+            <w:tcW w:type="dxa" w:w="4656"/>
+            <w:tcMar>
+              <w:top w:w="60" w:type="dxa"/>
+              <w:bottom w:w="60" w:type="dxa"/>
+              <w:start w:w="100" w:type="dxa"/>
+              <w:end w:w="100" w:type="dxa"/>
+            </w:tcMar>
+          </w:tcPr>
+          <w:p>
+            <w:r/>
+            <w:r>
+              <w:rPr>
+                <w:sz w:val="20"/>
+              </w:rPr>
+              <w:t>Matriz dental de prueba</w:t>
+            </w:r>
+          </w:p>
+        </w:tc>
+      </w:tr>
+      <w:tr>
+        <w:tc>
+          <w:tcPr>
+            <w:tcW w:type="dxa" w:w="2873"/>
+            <w:shd w:fill="F8FCFB" w:val="clear"/>
+            <w:tcMar>
+              <w:top w:w="60" w:type="dxa"/>
+              <w:bottom w:w="60" w:type="dxa"/>
+              <w:start w:w="100" w:type="dxa"/>
+              <w:end w:w="100" w:type="dxa"/>
+            </w:tcMar>
+          </w:tcPr>
+          <w:p>
+            <w:r/>
+            <w:r>
+              <w:rPr>
+                <w:sz w:val="20"/>
+              </w:rPr>
+              <w:t>Dental Demo — Sucursal Centro</w:t>
+            </w:r>
+          </w:p>
+        </w:tc>
+        <w:tc>
+          <w:tcPr>
+            <w:tcW w:type="dxa" w:w="1882"/>
+            <w:shd w:fill="F8FCFB" w:val="clear"/>
+            <w:tcMar>
+              <w:top w:w="60" w:type="dxa"/>
+              <w:bottom w:w="60" w:type="dxa"/>
+              <w:start w:w="100" w:type="dxa"/>
+              <w:end w:w="100" w:type="dxa"/>
+            </w:tcMar>
+          </w:tcPr>
+          <w:p>
+            <w:r/>
+            <w:r>
+              <w:rPr>
+                <w:sz w:val="20"/>
+              </w:rPr>
+              <w:t>Centro Dental</w:t>
+            </w:r>
+          </w:p>
+        </w:tc>
+        <w:tc>
+          <w:tcPr>
+            <w:tcW w:type="dxa" w:w="4656"/>
+            <w:shd w:fill="F8FCFB" w:val="clear"/>
+            <w:tcMar>
+              <w:top w:w="60" w:type="dxa"/>
+              <w:bottom w:w="60" w:type="dxa"/>
+              <w:start w:w="100" w:type="dxa"/>
+              <w:end w:w="100" w:type="dxa"/>
+            </w:tcMar>
+          </w:tcPr>
+          <w:p>
+            <w:r/>
+            <w:r>
+              <w:rPr>
+                <w:sz w:val="20"/>
+              </w:rPr>
+              <w:t>Sucursal hija dental</w:t>
+            </w:r>
+          </w:p>
+        </w:tc>
+      </w:tr>
+      <w:tr>
+        <w:tc>
+          <w:tcPr>
+            <w:tcW w:type="dxa" w:w="2873"/>
+            <w:tcMar>
+              <w:top w:w="60" w:type="dxa"/>
+              <w:bottom w:w="60" w:type="dxa"/>
+              <w:start w:w="100" w:type="dxa"/>
+              <w:end w:w="100" w:type="dxa"/>
+            </w:tcMar>
+          </w:tcPr>
+          <w:p>
+            <w:r/>
+            <w:r>
+              <w:rPr>
+                <w:sz w:val="20"/>
+              </w:rPr>
+              <w:t>Veterinaria Demo Sur</w:t>
+            </w:r>
+          </w:p>
+        </w:tc>
+        <w:tc>
+          <w:tcPr>
+            <w:tcW w:type="dxa" w:w="1882"/>
+            <w:tcMar>
+              <w:top w:w="60" w:type="dxa"/>
+              <w:bottom w:w="60" w:type="dxa"/>
+              <w:start w:w="100" w:type="dxa"/>
+              <w:end w:w="100" w:type="dxa"/>
+            </w:tcMar>
+          </w:tcPr>
+          <w:p>
+            <w:r/>
+            <w:r>
+              <w:rPr>
+                <w:sz w:val="20"/>
+              </w:rPr>
+              <w:t>Veterinario</w:t>
+            </w:r>
+          </w:p>
+        </w:tc>
+        <w:tc>
+          <w:tcPr>
+            <w:tcW w:type="dxa" w:w="4656"/>
+            <w:tcMar>
+              <w:top w:w="60" w:type="dxa"/>
+              <w:bottom w:w="60" w:type="dxa"/>
+              <w:start w:w="100" w:type="dxa"/>
+              <w:end w:w="100" w:type="dxa"/>
+            </w:tcMar>
+          </w:tcPr>
+          <w:p>
+            <w:r/>
+            <w:r>
+              <w:rPr>
+                <w:sz w:val="20"/>
+              </w:rPr>
+              <w:t>Matriz veterinaria de prueba</w:t>
+            </w:r>
+          </w:p>
+        </w:tc>
+      </w:tr>
+      <w:tr>
+        <w:tc>
+          <w:tcPr>
+            <w:tcW w:type="dxa" w:w="2873"/>
+            <w:shd w:fill="F8FCFB" w:val="clear"/>
+            <w:tcMar>
+              <w:top w:w="60" w:type="dxa"/>
+              <w:bottom w:w="60" w:type="dxa"/>
+              <w:start w:w="100" w:type="dxa"/>
+              <w:end w:w="100" w:type="dxa"/>
+            </w:tcMar>
+          </w:tcPr>
+          <w:p>
+            <w:r/>
+            <w:r>
+              <w:rPr>
+                <w:sz w:val="20"/>
+              </w:rPr>
+              <w:t>Veterinaria Demo — Urgencias 24h</w:t>
+            </w:r>
+          </w:p>
+        </w:tc>
+        <w:tc>
+          <w:tcPr>
+            <w:tcW w:type="dxa" w:w="1882"/>
+            <w:shd w:fill="F8FCFB" w:val="clear"/>
+            <w:tcMar>
+              <w:top w:w="60" w:type="dxa"/>
+              <w:bottom w:w="60" w:type="dxa"/>
+              <w:start w:w="100" w:type="dxa"/>
+              <w:end w:w="100" w:type="dxa"/>
+            </w:tcMar>
+          </w:tcPr>
+          <w:p>
+            <w:r/>
+            <w:r>
+              <w:rPr>
+                <w:sz w:val="20"/>
+              </w:rPr>
+              <w:t>Veterinario</w:t>
+            </w:r>
+          </w:p>
+        </w:tc>
+        <w:tc>
+          <w:tcPr>
+            <w:tcW w:type="dxa" w:w="4656"/>
+            <w:shd w:fill="F8FCFB" w:val="clear"/>
+            <w:tcMar>
+              <w:top w:w="60" w:type="dxa"/>
+              <w:bottom w:w="60" w:type="dxa"/>
+              <w:start w:w="100" w:type="dxa"/>
+              <w:end w:w="100" w:type="dxa"/>
+            </w:tcMar>
+          </w:tcPr>
+          <w:p>
+            <w:r/>
+            <w:r>
+              <w:rPr>
+                <w:sz w:val="20"/>
+              </w:rPr>
+              <w:t>Sucursal veterinaria</w:t>
+            </w:r>
+          </w:p>
+        </w:tc>
+      </w:tr>
+      <w:tr>
+        <w:tc>
+          <w:tcPr>
+            <w:tcW w:type="dxa" w:w="2873"/>
+            <w:tcMar>
+              <w:top w:w="60" w:type="dxa"/>
+              <w:bottom w:w="60" w:type="dxa"/>
+              <w:start w:w="100" w:type="dxa"/>
+              <w:end w:w="100" w:type="dxa"/>
+            </w:tcMar>
+          </w:tcPr>
+          <w:p>
+            <w:r/>
+            <w:r>
+              <w:rPr>
+                <w:sz w:val="20"/>
+              </w:rPr>
+              <w:t>Centro de Diagnóstico RIS PRO</w:t>
+            </w:r>
+          </w:p>
+        </w:tc>
+        <w:tc>
+          <w:tcPr>
+            <w:tcW w:type="dxa" w:w="1882"/>
+            <w:tcMar>
+              <w:top w:w="60" w:type="dxa"/>
+              <w:bottom w:w="60" w:type="dxa"/>
+              <w:start w:w="100" w:type="dxa"/>
+              <w:end w:w="100" w:type="dxa"/>
+            </w:tcMar>
+          </w:tcPr>
+          <w:p>
+            <w:r/>
+            <w:r>
+              <w:rPr>
+                <w:sz w:val="20"/>
+              </w:rPr>
+              <w:t>Clínico</w:t>
+            </w:r>
+          </w:p>
+        </w:tc>
+        <w:tc>
+          <w:tcPr>
+            <w:tcW w:type="dxa" w:w="4656"/>
+            <w:tcMar>
+              <w:top w:w="60" w:type="dxa"/>
+              <w:bottom w:w="60" w:type="dxa"/>
+              <w:start w:w="100" w:type="dxa"/>
+              <w:end w:w="100" w:type="dxa"/>
+            </w:tcMar>
+          </w:tcPr>
+          <w:p>
+            <w:r/>
+            <w:r>
+              <w:rPr>
+                <w:sz w:val="20"/>
+              </w:rPr>
+              <w:t>Flujo worklist clásico</w:t>
+            </w:r>
+          </w:p>
+        </w:tc>
+      </w:tr>
+    </w:tbl>
+    <w:p>
+      <w:pPr>
+        <w:spacing w:after="160"/>
+      </w:pPr>
+    </w:p>
+    <w:p>
+      <w:pPr>
+        <w:spacing w:after="120"/>
+        <w:jc w:val="left"/>
+      </w:pPr>
+      <w:r>
+        <w:rPr>
+          <w:b w:val="0"/>
+          <w:i w:val="0"/>
+        </w:rPr>
+        <w:t>Se crean al ejecutar php artisan db:seed. Para forzar modo manual en un centro clínico, el administrador puede guardar en settings del laboratorio: {"uses_dicom_worklist": false}.</w:t>
       </w:r>
     </w:p>
     <w:p>
@@ -4431,7 +5270,7 @@
           <w:b w:val="0"/>
           <w:i w:val="0"/>
         </w:rPr>
-        <w:t>Documentación técnica ampliada (códigos API, migraciones): docs/ESCALA_COMERCIAL.md, sección «Tipos de laboratorio».</w:t>
+        <w:t>Documentación técnica de instalación: docs/INSTALACION.md</w:t>
       </w:r>
     </w:p>
     <w:p>

</xml_diff>

<commit_message>
Fix OHIF viewer URL and refresh HealthTiCloud RIS instructivo.
Open viewer at /viewer with StudyInstanceUIDs, resolving UID from Orthanc by accession. Updated PDF/DOCX manual with sis_admin, secretaria, and viewer docs.

Co-authored-by: Cursor <cursoragent@cursor.com>
</commit_message>
<xml_diff>
--- a/docs/INSTRUCTIVO_HealthTiCloud_RIS.docx
+++ b/docs/INSTRUCTIVO_HealthTiCloud_RIS.docx
@@ -15,7 +15,7 @@
         <w:rPr>
           <w:b/>
           <w:i w:val="0"/>
-          <w:color w:val="2EC4B6"/>
+          <w:color w:val="A894C4"/>
           <w:sz w:val="56"/>
         </w:rPr>
         <w:t>HealthTiCloud RIS</w:t>
@@ -514,7 +514,7 @@
               <w:rPr>
                 <w:sz w:val="20"/>
               </w:rPr>
-              <w:t>Recepcionista, Administrador</w:t>
+              <w:t>Recepción, Secretaria, Administrador</w:t>
             </w:r>
           </w:p>
         </w:tc>
@@ -895,7 +895,7 @@
               <w:rPr>
                 <w:sz w:val="20"/>
               </w:rPr>
-              <w:t>Recepcionista, Administrador</w:t>
+              <w:t>Recepción, Secretaria, Administrador</w:t>
             </w:r>
           </w:p>
         </w:tc>
@@ -960,7 +960,7 @@
               <w:rPr>
                 <w:sz w:val="20"/>
               </w:rPr>
-              <w:t>Administrador</w:t>
+              <w:t>Administrador, Sys. Admin</w:t>
             </w:r>
           </w:p>
         </w:tc>
@@ -1710,7 +1710,7 @@
         <w:spacing w:after="60"/>
       </w:pPr>
       <w:r>
-        <w:t>Si su usuario es Recepcionista, verá Agenda y Entrega/Retiro (y Dashboard si está habilitado).</w:t>
+        <w:t>Recepción o Secretaria: Agenda y Entrega/Retiro (la secretaria solo edita pacientes en sede RDOX Osorno).</w:t>
       </w:r>
     </w:p>
     <w:p>
@@ -1719,7 +1719,7 @@
         <w:spacing w:after="60"/>
       </w:pPr>
       <w:r>
-        <w:t>Si es Tecnólogo en un centro clínico, verá Worklist; en dental o veterinario verá Atención en salas (no Worklist).</w:t>
+        <w:t>Tecnólogo en centro clínico: Worklist; en dental o veterinario: Atención en salas (no Worklist).</w:t>
       </w:r>
     </w:p>
     <w:p>
@@ -1728,7 +1728,7 @@
         <w:spacing w:after="60"/>
       </w:pPr>
       <w:r>
-        <w:t>Si es Radiólogo, verá Radiólogo y Validación.</w:t>
+        <w:t>Radiólogo: Radiólogo y Validación.</w:t>
       </w:r>
     </w:p>
     <w:p>
@@ -1737,7 +1737,7 @@
         <w:spacing w:after="60"/>
       </w:pPr>
       <w:r>
-        <w:t>Si es Transcriptor, verá solo Transcripción.</w:t>
+        <w:t>Transcriptor: solo Transcripción.</w:t>
       </w:r>
     </w:p>
     <w:p>
@@ -1746,7 +1746,7 @@
         <w:spacing w:after="60"/>
       </w:pPr>
       <w:r>
-        <w:t>Si es Administrador del centro, verá todos los módulos operativos más Administración y Dashboard.</w:t>
+        <w:t>Administrador (admin): todos los módulos operativos y Administración, pero solo en sus laboratorios asignados.</w:t>
       </w:r>
     </w:p>
     <w:p>
@@ -1755,7 +1755,16 @@
         <w:spacing w:after="60"/>
       </w:pPr>
       <w:r>
-        <w:t>Un mismo usuario puede tener varios roles (por ejemplo recepción y tecnología); en ese caso verá la unión de los módulos de esos roles.</w:t>
+        <w:t>Sys. Admin (sis_admin): mismos módulos con selector «Visión Global» y acceso a todas las sedes del sistema.</w:t>
+      </w:r>
+    </w:p>
+    <w:p>
+      <w:pPr>
+        <w:pStyle w:val="ListBullet"/>
+        <w:spacing w:after="60"/>
+      </w:pPr>
+      <w:r>
+        <w:t>Un usuario puede tener varios roles en settings; el menú muestra la unión de módulos permitidos.</w:t>
       </w:r>
     </w:p>
     <w:p>
@@ -1942,7 +1951,7 @@
               <w:rPr>
                 <w:sz w:val="20"/>
               </w:rPr>
-              <w:t>recepcion, admin</w:t>
+              <w:t>recepcion, secretaria, secretario, admin, sis_admin</w:t>
             </w:r>
           </w:p>
         </w:tc>
@@ -1986,7 +1995,7 @@
               <w:rPr>
                 <w:sz w:val="20"/>
               </w:rPr>
-              <w:t>tecnologo, admin (solo centros con MWL)</w:t>
+              <w:t>tecnologo, admin, sis_admin (clínico con MWL)</w:t>
             </w:r>
           </w:p>
         </w:tc>
@@ -2028,7 +2037,7 @@
               <w:rPr>
                 <w:sz w:val="20"/>
               </w:rPr>
-              <w:t>tecnologo, admin (dental / veterinario / sin MWL)</w:t>
+              <w:t>tecnologo, admin, sis_admin (dental / vet / sin MWL)</w:t>
             </w:r>
           </w:p>
         </w:tc>
@@ -2072,7 +2081,7 @@
               <w:rPr>
                 <w:sz w:val="20"/>
               </w:rPr>
-              <w:t>radiologo, admin</w:t>
+              <w:t>radiologo, admin, sis_admin</w:t>
             </w:r>
           </w:p>
         </w:tc>
@@ -2114,7 +2123,7 @@
               <w:rPr>
                 <w:sz w:val="20"/>
               </w:rPr>
-              <w:t>transcriptor, admin</w:t>
+              <w:t>transcriptor, admin, sis_admin</w:t>
             </w:r>
           </w:p>
         </w:tc>
@@ -2158,7 +2167,7 @@
               <w:rPr>
                 <w:sz w:val="20"/>
               </w:rPr>
-              <w:t>radiologo, admin</w:t>
+              <w:t>radiologo, admin, sis_admin</w:t>
             </w:r>
           </w:p>
         </w:tc>
@@ -2200,7 +2209,7 @@
               <w:rPr>
                 <w:sz w:val="20"/>
               </w:rPr>
-              <w:t>recepcion, admin</w:t>
+              <w:t>recepcion, secretaria, secretario, admin, sis_admin</w:t>
             </w:r>
           </w:p>
         </w:tc>
@@ -2244,7 +2253,7 @@
               <w:rPr>
                 <w:sz w:val="20"/>
               </w:rPr>
-              <w:t>admin</w:t>
+              <w:t>admin, sis_admin</w:t>
             </w:r>
           </w:p>
         </w:tc>
@@ -2286,7 +2295,358 @@
               <w:rPr>
                 <w:sz w:val="20"/>
               </w:rPr>
-              <w:t>admin, recepcion, tecnologo, radiologo, transcriptor</w:t>
+              <w:t>admin, recepcion, tecnologo, radiologo, transcriptor, sis_admin</w:t>
+            </w:r>
+          </w:p>
+        </w:tc>
+      </w:tr>
+    </w:tbl>
+    <w:p>
+      <w:pPr>
+        <w:spacing w:after="160"/>
+      </w:pPr>
+    </w:p>
+    <w:p>
+      <w:pPr>
+        <w:pStyle w:val="Heading2"/>
+      </w:pPr>
+      <w:r>
+        <w:t>Administrador vs Sys. Admin</w:t>
+      </w:r>
+    </w:p>
+    <w:tbl>
+      <w:tblPr>
+        <w:tblStyle w:val="TableGrid"/>
+        <w:tblW w:type="auto" w:w="0"/>
+        <w:tblLayout w:type="fixed"/>
+        <w:tblLook w:firstColumn="1" w:firstRow="1" w:lastColumn="0" w:lastRow="0" w:noHBand="0" w:noVBand="1" w:val="04A0"/>
+      </w:tblPr>
+      <w:tblGrid>
+        <w:gridCol w:w="3137"/>
+        <w:gridCol w:w="3137"/>
+        <w:gridCol w:w="3137"/>
+      </w:tblGrid>
+      <w:tr>
+        <w:tc>
+          <w:tcPr>
+            <w:tcW w:type="dxa" w:w="2447"/>
+            <w:shd w:fill="2EC4B6" w:val="clear"/>
+            <w:tcMar>
+              <w:top w:w="60" w:type="dxa"/>
+              <w:bottom w:w="60" w:type="dxa"/>
+              <w:start w:w="100" w:type="dxa"/>
+              <w:end w:w="100" w:type="dxa"/>
+            </w:tcMar>
+          </w:tcPr>
+          <w:p>
+            <w:r/>
+            <w:r>
+              <w:rPr>
+                <w:b/>
+                <w:color w:val="FFFFFF"/>
+                <w:sz w:val="20"/>
+              </w:rPr>
+              <w:t>Aspecto</w:t>
+            </w:r>
+          </w:p>
+        </w:tc>
+        <w:tc>
+          <w:tcPr>
+            <w:tcW w:type="dxa" w:w="3482"/>
+            <w:shd w:fill="2EC4B6" w:val="clear"/>
+            <w:tcMar>
+              <w:top w:w="60" w:type="dxa"/>
+              <w:bottom w:w="60" w:type="dxa"/>
+              <w:start w:w="100" w:type="dxa"/>
+              <w:end w:w="100" w:type="dxa"/>
+            </w:tcMar>
+          </w:tcPr>
+          <w:p>
+            <w:r/>
+            <w:r>
+              <w:rPr>
+                <w:b/>
+                <w:color w:val="FFFFFF"/>
+                <w:sz w:val="20"/>
+              </w:rPr>
+              <w:t>admin (centro)</w:t>
+            </w:r>
+          </w:p>
+        </w:tc>
+        <w:tc>
+          <w:tcPr>
+            <w:tcW w:type="dxa" w:w="3482"/>
+            <w:shd w:fill="2EC4B6" w:val="clear"/>
+            <w:tcMar>
+              <w:top w:w="60" w:type="dxa"/>
+              <w:bottom w:w="60" w:type="dxa"/>
+              <w:start w:w="100" w:type="dxa"/>
+              <w:end w:w="100" w:type="dxa"/>
+            </w:tcMar>
+          </w:tcPr>
+          <w:p>
+            <w:r/>
+            <w:r>
+              <w:rPr>
+                <w:b/>
+                <w:color w:val="FFFFFF"/>
+                <w:sz w:val="20"/>
+              </w:rPr>
+              <w:t>sis_admin (sistema)</w:t>
+            </w:r>
+          </w:p>
+        </w:tc>
+      </w:tr>
+      <w:tr>
+        <w:tc>
+          <w:tcPr>
+            <w:tcW w:type="dxa" w:w="2447"/>
+            <w:tcMar>
+              <w:top w:w="60" w:type="dxa"/>
+              <w:bottom w:w="60" w:type="dxa"/>
+              <w:start w:w="100" w:type="dxa"/>
+              <w:end w:w="100" w:type="dxa"/>
+            </w:tcMar>
+          </w:tcPr>
+          <w:p>
+            <w:r/>
+            <w:r>
+              <w:rPr>
+                <w:sz w:val="20"/>
+              </w:rPr>
+              <w:t>Laboratorios visibles</w:t>
+            </w:r>
+          </w:p>
+        </w:tc>
+        <w:tc>
+          <w:tcPr>
+            <w:tcW w:type="dxa" w:w="3482"/>
+            <w:tcMar>
+              <w:top w:w="60" w:type="dxa"/>
+              <w:bottom w:w="60" w:type="dxa"/>
+              <w:start w:w="100" w:type="dxa"/>
+              <w:end w:w="100" w:type="dxa"/>
+            </w:tcMar>
+          </w:tcPr>
+          <w:p>
+            <w:r/>
+            <w:r>
+              <w:rPr>
+                <w:sz w:val="20"/>
+              </w:rPr>
+              <w:t>Solo asignados (matriz + sucursales)</w:t>
+            </w:r>
+          </w:p>
+        </w:tc>
+        <w:tc>
+          <w:tcPr>
+            <w:tcW w:type="dxa" w:w="3482"/>
+            <w:tcMar>
+              <w:top w:w="60" w:type="dxa"/>
+              <w:bottom w:w="60" w:type="dxa"/>
+              <w:start w:w="100" w:type="dxa"/>
+              <w:end w:w="100" w:type="dxa"/>
+            </w:tcMar>
+          </w:tcPr>
+          <w:p>
+            <w:r/>
+            <w:r>
+              <w:rPr>
+                <w:sz w:val="20"/>
+              </w:rPr>
+              <w:t>Todos (Visión Global o cualquier sede)</w:t>
+            </w:r>
+          </w:p>
+        </w:tc>
+      </w:tr>
+      <w:tr>
+        <w:tc>
+          <w:tcPr>
+            <w:tcW w:type="dxa" w:w="2447"/>
+            <w:shd w:fill="F8FCFB" w:val="clear"/>
+            <w:tcMar>
+              <w:top w:w="60" w:type="dxa"/>
+              <w:bottom w:w="60" w:type="dxa"/>
+              <w:start w:w="100" w:type="dxa"/>
+              <w:end w:w="100" w:type="dxa"/>
+            </w:tcMar>
+          </w:tcPr>
+          <w:p>
+            <w:r/>
+            <w:r>
+              <w:rPr>
+                <w:sz w:val="20"/>
+              </w:rPr>
+              <w:t>Crear matrices nuevas</w:t>
+            </w:r>
+          </w:p>
+        </w:tc>
+        <w:tc>
+          <w:tcPr>
+            <w:tcW w:type="dxa" w:w="3482"/>
+            <w:shd w:fill="F8FCFB" w:val="clear"/>
+            <w:tcMar>
+              <w:top w:w="60" w:type="dxa"/>
+              <w:bottom w:w="60" w:type="dxa"/>
+              <w:start w:w="100" w:type="dxa"/>
+              <w:end w:w="100" w:type="dxa"/>
+            </w:tcMar>
+          </w:tcPr>
+          <w:p>
+            <w:r/>
+            <w:r>
+              <w:rPr>
+                <w:sz w:val="20"/>
+              </w:rPr>
+              <w:t>No</w:t>
+            </w:r>
+          </w:p>
+        </w:tc>
+        <w:tc>
+          <w:tcPr>
+            <w:tcW w:type="dxa" w:w="3482"/>
+            <w:shd w:fill="F8FCFB" w:val="clear"/>
+            <w:tcMar>
+              <w:top w:w="60" w:type="dxa"/>
+              <w:bottom w:w="60" w:type="dxa"/>
+              <w:start w:w="100" w:type="dxa"/>
+              <w:end w:w="100" w:type="dxa"/>
+            </w:tcMar>
+          </w:tcPr>
+          <w:p>
+            <w:r/>
+            <w:r>
+              <w:rPr>
+                <w:sz w:val="20"/>
+              </w:rPr>
+              <w:t>Sí (Administración)</w:t>
+            </w:r>
+          </w:p>
+        </w:tc>
+      </w:tr>
+      <w:tr>
+        <w:tc>
+          <w:tcPr>
+            <w:tcW w:type="dxa" w:w="2447"/>
+            <w:tcMar>
+              <w:top w:w="60" w:type="dxa"/>
+              <w:bottom w:w="60" w:type="dxa"/>
+              <w:start w:w="100" w:type="dxa"/>
+              <w:end w:w="100" w:type="dxa"/>
+            </w:tcMar>
+          </w:tcPr>
+          <w:p>
+            <w:r/>
+            <w:r>
+              <w:rPr>
+                <w:sz w:val="20"/>
+              </w:rPr>
+              <w:t>Crear usuarios secretaria</w:t>
+            </w:r>
+          </w:p>
+        </w:tc>
+        <w:tc>
+          <w:tcPr>
+            <w:tcW w:type="dxa" w:w="3482"/>
+            <w:tcMar>
+              <w:top w:w="60" w:type="dxa"/>
+              <w:bottom w:w="60" w:type="dxa"/>
+              <w:start w:w="100" w:type="dxa"/>
+              <w:end w:w="100" w:type="dxa"/>
+            </w:tcMar>
+          </w:tcPr>
+          <w:p>
+            <w:r/>
+            <w:r>
+              <w:rPr>
+                <w:sz w:val="20"/>
+              </w:rPr>
+              <w:t>Sí</w:t>
+            </w:r>
+          </w:p>
+        </w:tc>
+        <w:tc>
+          <w:tcPr>
+            <w:tcW w:type="dxa" w:w="3482"/>
+            <w:tcMar>
+              <w:top w:w="60" w:type="dxa"/>
+              <w:bottom w:w="60" w:type="dxa"/>
+              <w:start w:w="100" w:type="dxa"/>
+              <w:end w:w="100" w:type="dxa"/>
+            </w:tcMar>
+          </w:tcPr>
+          <w:p>
+            <w:r/>
+            <w:r>
+              <w:rPr>
+                <w:sz w:val="20"/>
+              </w:rPr>
+              <w:t>Sí</w:t>
+            </w:r>
+          </w:p>
+        </w:tc>
+      </w:tr>
+      <w:tr>
+        <w:tc>
+          <w:tcPr>
+            <w:tcW w:type="dxa" w:w="2447"/>
+            <w:shd w:fill="F8FCFB" w:val="clear"/>
+            <w:tcMar>
+              <w:top w:w="60" w:type="dxa"/>
+              <w:bottom w:w="60" w:type="dxa"/>
+              <w:start w:w="100" w:type="dxa"/>
+              <w:end w:w="100" w:type="dxa"/>
+            </w:tcMar>
+          </w:tcPr>
+          <w:p>
+            <w:r/>
+            <w:r>
+              <w:rPr>
+                <w:sz w:val="20"/>
+              </w:rPr>
+              <w:t>Datos en módulos</w:t>
+            </w:r>
+          </w:p>
+        </w:tc>
+        <w:tc>
+          <w:tcPr>
+            <w:tcW w:type="dxa" w:w="3482"/>
+            <w:shd w:fill="F8FCFB" w:val="clear"/>
+            <w:tcMar>
+              <w:top w:w="60" w:type="dxa"/>
+              <w:bottom w:w="60" w:type="dxa"/>
+              <w:start w:w="100" w:type="dxa"/>
+              <w:end w:w="100" w:type="dxa"/>
+            </w:tcMar>
+          </w:tcPr>
+          <w:p>
+            <w:r/>
+            <w:r>
+              <w:rPr>
+                <w:sz w:val="20"/>
+              </w:rPr>
+              <w:t>Filtrados a sus sedes</w:t>
+            </w:r>
+          </w:p>
+        </w:tc>
+        <w:tc>
+          <w:tcPr>
+            <w:tcW w:type="dxa" w:w="3482"/>
+            <w:shd w:fill="F8FCFB" w:val="clear"/>
+            <w:tcMar>
+              <w:top w:w="60" w:type="dxa"/>
+              <w:bottom w:w="60" w:type="dxa"/>
+              <w:start w:w="100" w:type="dxa"/>
+              <w:end w:w="100" w:type="dxa"/>
+            </w:tcMar>
+          </w:tcPr>
+          <w:p>
+            <w:r/>
+            <w:r>
+              <w:rPr>
+                <w:sz w:val="20"/>
+              </w:rPr>
+              <w:t>Todos los del sistema o sede elegida</w:t>
             </w:r>
           </w:p>
         </w:tc>
@@ -3006,6 +3366,72 @@
         <w:pStyle w:val="Heading2"/>
       </w:pPr>
       <w:r>
+        <w:t>Visor OHIF (imágenes)</w:t>
+      </w:r>
+    </w:p>
+    <w:p>
+      <w:pPr>
+        <w:spacing w:after="120"/>
+        <w:jc w:val="left"/>
+      </w:pPr>
+      <w:r>
+        <w:rPr>
+          <w:b w:val="0"/>
+          <w:i w:val="0"/>
+        </w:rPr>
+        <w:t>Desde Radiólogo o Validación, el botón del visor abre el OHIF en una pestaña nueva. La URL usa el formato del visor centralizado:</w:t>
+      </w:r>
+    </w:p>
+    <w:p>
+      <w:pPr>
+        <w:pStyle w:val="ListBullet"/>
+        <w:spacing w:after="60"/>
+      </w:pPr>
+      <w:r>
+        <w:t>Base: https://viewer.healthticloud.cl/viewer</w:t>
+      </w:r>
+    </w:p>
+    <w:p>
+      <w:pPr>
+        <w:pStyle w:val="ListBullet"/>
+        <w:spacing w:after="60"/>
+      </w:pPr>
+      <w:r>
+        <w:t>Parámetro: StudyInstanceUIDs=&lt;UID del estudio en PACS&gt;</w:t>
+      </w:r>
+    </w:p>
+    <w:p>
+      <w:pPr>
+        <w:pStyle w:val="ListBullet"/>
+        <w:spacing w:after="60"/>
+      </w:pPr>
+      <w:r>
+        <w:t>Ejemplo: …/viewer?StudyInstanceUIDs=1.2.620.54321.0.27187.0.0.20260526.104437</w:t>
+      </w:r>
+    </w:p>
+    <w:p>
+      <w:pPr>
+        <w:pStyle w:val="ListBullet"/>
+        <w:spacing w:after="60"/>
+      </w:pPr>
+      <w:r>
+        <w:t>El RIS resuelve el UID consultando Orthanc/PACS a partir del accession de la cita si hace falta.</w:t>
+      </w:r>
+    </w:p>
+    <w:p>
+      <w:pPr>
+        <w:pStyle w:val="ListBullet"/>
+        <w:spacing w:after="60"/>
+      </w:pPr>
+      <w:r>
+        <w:t>Si no hay bridge local (RadiAnt/Weasis), se usa OHIF como respaldo automático.</w:t>
+      </w:r>
+    </w:p>
+    <w:p>
+      <w:pPr>
+        <w:pStyle w:val="Heading2"/>
+      </w:pPr>
+      <w:r>
         <w:t>Qué puede hacer aquí</w:t>
       </w:r>
     </w:p>
@@ -3024,7 +3450,7 @@
         <w:spacing w:after="60"/>
       </w:pPr>
       <w:r>
-        <w:t>Abrir visor DICOM/PACS vinculado al accession number del estudio.</w:t>
+        <w:t>Abrir visor DICOM web (OHIF) o visor local si el bridge está instalado en la PC.</w:t>
       </w:r>
     </w:p>
     <w:p>
@@ -3547,6 +3973,59 @@
         <w:pStyle w:val="Heading2"/>
       </w:pPr>
       <w:r>
+        <w:t>Usuarios y rol Secretaria</w:t>
+      </w:r>
+    </w:p>
+    <w:p>
+      <w:pPr>
+        <w:pStyle w:val="ListNumber"/>
+        <w:spacing w:after="60"/>
+      </w:pPr>
+      <w:r>
+        <w:t>Administración → Usuarios → Nuevo usuario.</w:t>
+      </w:r>
+    </w:p>
+    <w:p>
+      <w:pPr>
+        <w:pStyle w:val="ListNumber"/>
+        <w:spacing w:after="60"/>
+      </w:pPr>
+      <w:r>
+        <w:t>Complete datos personales, usuario y contraseña.</w:t>
+      </w:r>
+    </w:p>
+    <w:p>
+      <w:pPr>
+        <w:pStyle w:val="ListNumber"/>
+        <w:spacing w:after="60"/>
+      </w:pPr>
+      <w:r>
+        <w:t>Marque el rol Secretaria (u otros roles operativos necesarios).</w:t>
+      </w:r>
+    </w:p>
+    <w:p>
+      <w:pPr>
+        <w:pStyle w:val="ListNumber"/>
+        <w:spacing w:after="60"/>
+      </w:pPr>
+      <w:r>
+        <w:t>Asigne al menos un laboratorio/sucursal y guarde.</w:t>
+      </w:r>
+    </w:p>
+    <w:p>
+      <w:pPr>
+        <w:pStyle w:val="ListNumber"/>
+        <w:spacing w:after="60"/>
+      </w:pPr>
+      <w:r>
+        <w:t>La secretaria verá Agenda y Entrega; la edición de fichas de pacientes solo aplica en RDOX Osorno.</w:t>
+      </w:r>
+    </w:p>
+    <w:p>
+      <w:pPr>
+        <w:pStyle w:val="Heading2"/>
+      </w:pPr>
+      <w:r>
         <w:t>Qué puede hacer aquí</w:t>
       </w:r>
     </w:p>
@@ -3556,7 +4035,7 @@
         <w:spacing w:after="60"/>
       </w:pPr>
       <w:r>
-        <w:t>Gestionar usuarios: crear, editar roles, asignar laboratorios.</w:t>
+        <w:t>Gestionar usuarios: crear, editar roles (incluye secretaria), asignar laboratorios.</w:t>
       </w:r>
     </w:p>
     <w:p>
@@ -5239,7 +5718,7 @@
         <w:spacing w:after="60"/>
       </w:pPr>
       <w:r>
-        <w:t>Usuarios, roles, salas, modalidades DICOM, Orthanc/PACS y visor OHIF (si está desplegado).</w:t>
+        <w:t>Usuarios, roles, salas, modalidades DICOM, Orthanc/PACS y visor OHIF (https://viewer.healthticloud.cl).</w:t>
       </w:r>
     </w:p>
     <w:p>
@@ -5257,7 +5736,7 @@
         <w:spacing w:after="60"/>
       </w:pPr>
       <w:r>
-        <w:t>Portal del paciente y visor web suelen ser servicios aparte (subdominios del proveedor).</w:t>
+        <w:t>Portal del paciente: https://portal.healthticloud.cl (servicio aparte).</w:t>
       </w:r>
     </w:p>
     <w:p>
@@ -5305,6 +5784,33 @@
         <w:spacing w:after="60"/>
       </w:pPr>
       <w:r>
+        <w:t>URL producción RIS: https://ris.healthticloud.cl — API en /api (config.js con detección automática).</w:t>
+      </w:r>
+    </w:p>
+    <w:p>
+      <w:pPr>
+        <w:pStyle w:val="ListBullet"/>
+        <w:spacing w:after="60"/>
+      </w:pPr>
+      <w:r>
+        <w:t>Visor OHIF: VIEWER_URL + VIEWER_PATH=/viewer + VIEWER_QUERY_PARAM=StudyInstanceUIDs.</w:t>
+      </w:r>
+    </w:p>
+    <w:p>
+      <w:pPr>
+        <w:pStyle w:val="ListBullet"/>
+        <w:spacing w:after="60"/>
+      </w:pPr>
+      <w:r>
+        <w:t>Resolución UID: GET /api/viewer-study-uid?accession=… (consulta Orthanc).</w:t>
+      </w:r>
+    </w:p>
+    <w:p>
+      <w:pPr>
+        <w:pStyle w:val="ListBullet"/>
+        <w:spacing w:after="60"/>
+      </w:pPr>
+      <w:r>
         <w:t>Regenerar PDF: python docs/generate_instructivo.py</w:t>
       </w:r>
     </w:p>
@@ -5342,6 +5848,15 @@
       </w:pPr>
       <w:r>
         <w:t>Perfil de laboratorio API: GET /api/lab-profile (header X-Lab-Id).</w:t>
+      </w:r>
+    </w:p>
+    <w:p>
+      <w:pPr>
+        <w:pStyle w:val="ListBullet"/>
+        <w:spacing w:after="60"/>
+      </w:pPr>
+      <w:r>
+        <w:t>Demos operativos: php artisan db:seed --class=DemoModulesSeeder (sedes DEMO-L*, sin tocar SIRESA).</w:t>
       </w:r>
     </w:p>
     <w:sectPr>
@@ -5787,7 +6302,7 @@
       <w:rFonts w:asciiTheme="majorHAnsi" w:eastAsiaTheme="majorEastAsia" w:hAnsiTheme="majorHAnsi" w:cstheme="majorBidi" w:ascii="Calibri" w:hAnsi="Calibri"/>
       <w:b/>
       <w:bCs/>
-      <w:color w:val="2EC4B6"/>
+      <w:color w:val="A894C4"/>
       <w:sz w:val="36"/>
       <w:szCs w:val="28"/>
     </w:rPr>

</xml_diff>

<commit_message>
fix: Docker LAN PHP 8.3, .env.lan versionado e instructivo ampliado
Alinea Dockerfile con composer (^8.3), publica .env.lan.example como .env.example,
documenta stack LAN en guias, regenera PDF/DOCX con marca accesible y capitulos nuevos.

Co-authored-by: Cursor <cursoragent@cursor.com>
</commit_message>
<xml_diff>
--- a/docs/INSTRUCTIVO_HealthTiCloud_RIS.docx
+++ b/docs/INSTRUCTIVO_HealthTiCloud_RIS.docx
@@ -15,7 +15,7 @@
         <w:rPr>
           <w:b/>
           <w:i w:val="0"/>
-          <w:color w:val="A894C4"/>
+          <w:color w:val="5B4A82"/>
           <w:sz w:val="56"/>
         </w:rPr>
         <w:t>HealthTiCloud RIS</w:t>
@@ -263,7 +263,7 @@
         <w:ind w:left="283"/>
       </w:pPr>
       <w:r>
-        <w:t>11. Módulo Dashboard</w:t>
+        <w:t>11. Módulo Dashboard y alertas</w:t>
       </w:r>
     </w:p>
     <w:p>
@@ -283,7 +283,47 @@
         <w:ind w:left="283"/>
       </w:pPr>
       <w:r>
-        <w:t>13. Anexo técnico</w:t>
+        <w:t>13. Dictado por voz, visor OHIF y bridge local</w:t>
+      </w:r>
+    </w:p>
+    <w:p>
+      <w:pPr>
+        <w:pStyle w:val="ListBullet"/>
+        <w:spacing w:after="40"/>
+        <w:ind w:left="283"/>
+      </w:pPr>
+      <w:r>
+        <w:t>14. Perfil Secretaria</w:t>
+      </w:r>
+    </w:p>
+    <w:p>
+      <w:pPr>
+        <w:pStyle w:val="ListBullet"/>
+        <w:spacing w:after="40"/>
+        <w:ind w:left="283"/>
+      </w:pPr>
+      <w:r>
+        <w:t>15. Sincronización con la nube</w:t>
+      </w:r>
+    </w:p>
+    <w:p>
+      <w:pPr>
+        <w:pStyle w:val="ListBullet"/>
+        <w:spacing w:after="40"/>
+        <w:ind w:left="283"/>
+      </w:pPr>
+      <w:r>
+        <w:t>16. Preguntas frecuentes</w:t>
+      </w:r>
+    </w:p>
+    <w:p>
+      <w:pPr>
+        <w:pStyle w:val="ListBullet"/>
+        <w:spacing w:after="40"/>
+        <w:ind w:left="283"/>
+      </w:pPr>
+      <w:r>
+        <w:t>17. Anexo técnico</w:t>
       </w:r>
     </w:p>
     <w:p>
@@ -1834,7 +1874,25 @@
         <w:spacing w:after="60"/>
       </w:pPr>
       <w:r>
-        <w:t>Barra superior: laboratorio activo, nombre de usuario y rol.</w:t>
+        <w:t>Barra superior: laboratorio activo, selector de sede, nombre de usuario y rol.</w:t>
+      </w:r>
+    </w:p>
+    <w:p>
+      <w:pPr>
+        <w:pStyle w:val="ListBullet"/>
+        <w:spacing w:after="60"/>
+      </w:pPr>
+      <w:r>
+        <w:t>Botón «Hoy» en Agenda: centra el calendario en la fecha actual (use las flechas para otros días).</w:t>
+      </w:r>
+    </w:p>
+    <w:p>
+      <w:pPr>
+        <w:pStyle w:val="ListBullet"/>
+        <w:spacing w:after="60"/>
+      </w:pPr>
+      <w:r>
+        <w:t>Paleta morada (#5b4a82): botones principales y encabezados; textos en gris oscuro para buena lectura.</w:t>
       </w:r>
     </w:p>
     <w:p>
@@ -1853,6 +1911,41 @@
       </w:pPr>
       <w:r>
         <w:t>Modales de confirmación: acciones importantes piden confirmación antes de ejecutarse.</w:t>
+      </w:r>
+    </w:p>
+    <w:p>
+      <w:pPr>
+        <w:pStyle w:val="Heading2"/>
+      </w:pPr>
+      <w:r>
+        <w:t>Contraseña y recuperación</w:t>
+      </w:r>
+    </w:p>
+    <w:p>
+      <w:pPr>
+        <w:pStyle w:val="ListNumber"/>
+        <w:spacing w:after="60"/>
+      </w:pPr>
+      <w:r>
+        <w:t>En la pantalla de login use «¿Olvidó su contraseña?» si el centro tiene correo configurado.</w:t>
+      </w:r>
+    </w:p>
+    <w:p>
+      <w:pPr>
+        <w:pStyle w:val="ListNumber"/>
+        <w:spacing w:after="60"/>
+      </w:pPr>
+      <w:r>
+        <w:t>Tras el enlace recibido, defina una clave nueva que cumpla la política del centro.</w:t>
+      </w:r>
+    </w:p>
+    <w:p>
+      <w:pPr>
+        <w:pStyle w:val="ListNumber"/>
+        <w:spacing w:after="60"/>
+      </w:pPr>
+      <w:r>
+        <w:t>Si el administrador exige cambio al primer ingreso, el sistema redirige a «Cambiar contraseña».</w:t>
       </w:r>
     </w:p>
     <w:tbl>
@@ -4102,7 +4195,7 @@
         <w:pStyle w:val="Heading1"/>
       </w:pPr>
       <w:r>
-        <w:t>11. Módulo Dashboard</w:t>
+        <w:t>11. Módulo Dashboard y alertas</w:t>
       </w:r>
     </w:p>
     <w:p>
@@ -4223,6 +4316,27 @@
       </w:pPr>
       <w:r>
         <w:t>Usar el selector de laboratorio para filtrar sucursales (administradores multi-sede).</w:t>
+      </w:r>
+    </w:p>
+    <w:p>
+      <w:pPr>
+        <w:pStyle w:val="Heading2"/>
+      </w:pPr>
+      <w:r>
+        <w:t>Alertas operativas</w:t>
+      </w:r>
+    </w:p>
+    <w:p>
+      <w:pPr>
+        <w:spacing w:after="120"/>
+        <w:jc w:val="left"/>
+      </w:pPr>
+      <w:r>
+        <w:rPr>
+          <w:b w:val="0"/>
+          <w:i w:val="0"/>
+        </w:rPr>
+        <w:t>El panel puede resaltar citas con demora (TAT por encima del umbral configurado en el servidor), estudios en informe prolongado o colas de worklist. Revise el detalle en cada módulo (Agenda, Worklist, Radiólogo) para actuar.</w:t>
       </w:r>
     </w:p>
     <w:p>
@@ -5749,7 +5863,7 @@
           <w:b w:val="0"/>
           <w:i w:val="0"/>
         </w:rPr>
-        <w:t>Documentación técnica de instalación: docs/INSTALACION.md</w:t>
+        <w:t>Documentación técnica de instalación: docs/INSTALACION.md y docs/GUIA_INSTALACION_LABORATORIO.md (Docker LAN, PHP 8.3).</w:t>
       </w:r>
     </w:p>
     <w:p>
@@ -5762,7 +5876,631 @@
         <w:pStyle w:val="Heading1"/>
       </w:pPr>
       <w:r>
-        <w:t>13. Anexo técnico</w:t>
+        <w:t>13. Dictado por voz, visor OHIF y bridge local</w:t>
+      </w:r>
+    </w:p>
+    <w:p>
+      <w:pPr>
+        <w:spacing w:after="120"/>
+        <w:jc w:val="left"/>
+      </w:pPr>
+      <w:r>
+        <w:rPr>
+          <w:b w:val="0"/>
+          <w:i w:val="0"/>
+        </w:rPr>
+        <w:t>El radiólogo puede redactar informes con dictado por voz del navegador (Chrome/Edge) o con pedal SpeechMike HID si está habilitado en su PC.</w:t>
+      </w:r>
+    </w:p>
+    <w:p>
+      <w:pPr>
+        <w:pStyle w:val="Heading2"/>
+      </w:pPr>
+      <w:r>
+        <w:t>Dictado por voz en el navegador</w:t>
+      </w:r>
+    </w:p>
+    <w:p>
+      <w:pPr>
+        <w:pStyle w:val="ListNumber"/>
+        <w:spacing w:after="60"/>
+      </w:pPr>
+      <w:r>
+        <w:t>En Radiólogo o Transcripción, abra el editor de informe.</w:t>
+      </w:r>
+    </w:p>
+    <w:p>
+      <w:pPr>
+        <w:pStyle w:val="ListNumber"/>
+        <w:spacing w:after="60"/>
+      </w:pPr>
+      <w:r>
+        <w:t>Pulse el botón de micrófono; el navegador pedirá permiso de micrófono (una sola vez).</w:t>
+      </w:r>
+    </w:p>
+    <w:p>
+      <w:pPr>
+        <w:pStyle w:val="ListNumber"/>
+        <w:spacing w:after="60"/>
+      </w:pPr>
+      <w:r>
+        <w:t>Hable con claridad; el texto se inserta en el cursor. Detenga con el mismo botón.</w:t>
+      </w:r>
+    </w:p>
+    <w:p>
+      <w:pPr>
+        <w:pStyle w:val="ListNumber"/>
+        <w:spacing w:after="60"/>
+      </w:pPr>
+      <w:r>
+        <w:t>Si no aparece texto, compruebe que el sitio no esté bloqueado en configuración de privacidad.</w:t>
+      </w:r>
+    </w:p>
+    <w:p>
+      <w:pPr>
+        <w:pStyle w:val="Heading2"/>
+      </w:pPr>
+      <w:r>
+        <w:t>Visor OHIF (imágenes en la nube)</w:t>
+      </w:r>
+    </w:p>
+    <w:p>
+      <w:pPr>
+        <w:pStyle w:val="ListBullet"/>
+        <w:spacing w:after="60"/>
+      </w:pPr>
+      <w:r>
+        <w:t>Botón «Visor PACS» abre https://viewer.healthticloud.cl/viewer?StudyInstanceUIDs=…</w:t>
+      </w:r>
+    </w:p>
+    <w:p>
+      <w:pPr>
+        <w:pStyle w:val="ListBullet"/>
+        <w:spacing w:after="60"/>
+      </w:pPr>
+      <w:r>
+        <w:t>El RIS obtiene el StudyInstanceUID desde Orthanc usando el accession de la cita.</w:t>
+      </w:r>
+    </w:p>
+    <w:p>
+      <w:pPr>
+        <w:pStyle w:val="ListBullet"/>
+        <w:spacing w:after="60"/>
+      </w:pPr>
+      <w:r>
+        <w:t>Si hay bridge local (RadiAnt/Weasis) en la PC, puede usarse como alternativa.</w:t>
+      </w:r>
+    </w:p>
+    <w:p>
+      <w:pPr>
+        <w:pStyle w:val="Heading2"/>
+      </w:pPr>
+      <w:r>
+        <w:t>Bridge escáner/visor en recepción</w:t>
+      </w:r>
+    </w:p>
+    <w:p>
+      <w:pPr>
+        <w:spacing w:after="120"/>
+        <w:jc w:val="left"/>
+      </w:pPr>
+      <w:r>
+        <w:rPr>
+          <w:b w:val="0"/>
+          <w:i w:val="0"/>
+        </w:rPr>
+        <w:t>En PCs con escáner documental, el programa ris-local-bridge (Node.js + NAPS2) corre en http://127.0.0.1:8181. No es necesario en todas las estaciones; solo donde se digitalicen órdenes.</w:t>
+      </w:r>
+    </w:p>
+    <w:p>
+      <w:r>
+        <w:br w:type="page"/>
+      </w:r>
+    </w:p>
+    <w:p>
+      <w:pPr>
+        <w:pStyle w:val="Heading1"/>
+      </w:pPr>
+      <w:r>
+        <w:t>14. Perfil Secretaria</w:t>
+      </w:r>
+    </w:p>
+    <w:p>
+      <w:pPr>
+        <w:spacing w:after="120"/>
+        <w:jc w:val="left"/>
+      </w:pPr>
+      <w:r>
+        <w:rPr>
+          <w:b w:val="0"/>
+          <w:i w:val="0"/>
+        </w:rPr>
+        <w:t>La secretaria apoya recepción: agenda citas, entrega resultados y puede subir imágenes o informes según el centro. **No** edita fichas de paciente en PACS salvo excepción RDOX Osorno.</w:t>
+      </w:r>
+    </w:p>
+    <w:p>
+      <w:pPr>
+        <w:pStyle w:val="ListBullet"/>
+        <w:spacing w:after="60"/>
+      </w:pPr>
+      <w:r>
+        <w:t>Módulos visibles: Agenda y Entrega/Retiro (igual que recepción en muchos centros).</w:t>
+      </w:r>
+    </w:p>
+    <w:p>
+      <w:pPr>
+        <w:pStyle w:val="ListBullet"/>
+        <w:spacing w:after="60"/>
+      </w:pPr>
+      <w:r>
+        <w:t>Subida de DICOM o informes PDF cuando el flujo del centro lo permite.</w:t>
+      </w:r>
+    </w:p>
+    <w:p>
+      <w:pPr>
+        <w:pStyle w:val="ListBullet"/>
+        <w:spacing w:after="60"/>
+      </w:pPr>
+      <w:r>
+        <w:t>En RDOX Osorno puede corregir datos de paciente en PACS (política local).</w:t>
+      </w:r>
+    </w:p>
+    <w:p>
+      <w:pPr>
+        <w:pStyle w:val="ListBullet"/>
+        <w:spacing w:after="60"/>
+      </w:pPr>
+      <w:r>
+        <w:t>El administrador crea el usuario en Administración → Usuarios y asigna rol Secretaria.</w:t>
+      </w:r>
+    </w:p>
+    <w:p>
+      <w:r>
+        <w:br w:type="page"/>
+      </w:r>
+    </w:p>
+    <w:p>
+      <w:pPr>
+        <w:pStyle w:val="Heading1"/>
+      </w:pPr>
+      <w:r>
+        <w:t>15. Sincronización con la nube</w:t>
+      </w:r>
+    </w:p>
+    <w:p>
+      <w:pPr>
+        <w:spacing w:after="120"/>
+        <w:jc w:val="left"/>
+      </w:pPr>
+      <w:r>
+        <w:rPr>
+          <w:b w:val="0"/>
+          <w:i w:val="0"/>
+        </w:rPr>
+        <w:t>En instalaciones multi-sede, el servidor central (nube) concentra catálogos y puede recibir datos desde laboratorios LAN. Solo administradores del sistema o perfiles autorizados ven estas opciones.</w:t>
+      </w:r>
+    </w:p>
+    <w:p>
+      <w:pPr>
+        <w:pStyle w:val="Heading2"/>
+      </w:pPr>
+      <w:r>
+        <w:t>Desde un laboratorio (LAN)</w:t>
+      </w:r>
+    </w:p>
+    <w:p>
+      <w:pPr>
+        <w:pStyle w:val="ListBullet"/>
+        <w:spacing w:after="60"/>
+      </w:pPr>
+      <w:r>
+        <w:t>RIS_CLOUD_ROLE=local: el lab opera de forma autónoma y puede enviar entidades pendientes a la nube.</w:t>
+      </w:r>
+    </w:p>
+    <w:p>
+      <w:pPr>
+        <w:pStyle w:val="ListBullet"/>
+        <w:spacing w:after="60"/>
+      </w:pPr>
+      <w:r>
+        <w:t>Requiere CLOUD_API_BASE y CLOUD_SYNC_SECRET configurados por sistemas.</w:t>
+      </w:r>
+    </w:p>
+    <w:p>
+      <w:pPr>
+        <w:pStyle w:val="ListBullet"/>
+        <w:spacing w:after="60"/>
+      </w:pPr>
+      <w:r>
+        <w:t>En Administración puede aparecer «Enviar pendientes a nube» o sincronización por módulo.</w:t>
+      </w:r>
+    </w:p>
+    <w:p>
+      <w:pPr>
+        <w:pStyle w:val="Heading2"/>
+      </w:pPr>
+      <w:r>
+        <w:t>En el servidor nube</w:t>
+      </w:r>
+    </w:p>
+    <w:p>
+      <w:pPr>
+        <w:pStyle w:val="ListBullet"/>
+        <w:spacing w:after="60"/>
+      </w:pPr>
+      <w:r>
+        <w:t>RIS_CLOUD_ROLE=cloud: recibe actualizaciones inbound y publica catálogo para pull.</w:t>
+      </w:r>
+    </w:p>
+    <w:p>
+      <w:pPr>
+        <w:pStyle w:val="ListBullet"/>
+        <w:spacing w:after="60"/>
+      </w:pPr>
+      <w:r>
+        <w:t>Los labs descargan catálogo (exámenes, previsiones) sin duplicar carga manual.</w:t>
+      </w:r>
+    </w:p>
+    <w:p>
+      <w:pPr>
+        <w:spacing w:after="120"/>
+        <w:jc w:val="left"/>
+      </w:pPr>
+      <w:r>
+        <w:rPr>
+          <w:b w:val="0"/>
+          <w:i w:val="0"/>
+        </w:rPr>
+        <w:t>El personal de recepción no debe ejecutar sync manual salvo indicación de soporte.</w:t>
+      </w:r>
+    </w:p>
+    <w:p>
+      <w:r>
+        <w:br w:type="page"/>
+      </w:r>
+    </w:p>
+    <w:p>
+      <w:pPr>
+        <w:pStyle w:val="Heading1"/>
+      </w:pPr>
+      <w:r>
+        <w:t>16. Preguntas frecuentes</w:t>
+      </w:r>
+    </w:p>
+    <w:tbl>
+      <w:tblPr>
+        <w:tblStyle w:val="TableGrid"/>
+        <w:tblW w:type="auto" w:w="0"/>
+        <w:tblLayout w:type="fixed"/>
+        <w:tblLook w:firstColumn="1" w:firstRow="1" w:lastColumn="0" w:lastRow="0" w:noHBand="0" w:noVBand="1" w:val="04A0"/>
+      </w:tblPr>
+      <w:tblGrid>
+        <w:gridCol w:w="4706"/>
+        <w:gridCol w:w="4706"/>
+      </w:tblGrid>
+      <w:tr>
+        <w:tc>
+          <w:tcPr>
+            <w:tcW w:type="dxa" w:w="2576"/>
+            <w:shd w:fill="2EC4B6" w:val="clear"/>
+            <w:tcMar>
+              <w:top w:w="60" w:type="dxa"/>
+              <w:bottom w:w="60" w:type="dxa"/>
+              <w:start w:w="100" w:type="dxa"/>
+              <w:end w:w="100" w:type="dxa"/>
+            </w:tcMar>
+          </w:tcPr>
+          <w:p>
+            <w:r/>
+            <w:r>
+              <w:rPr>
+                <w:b/>
+                <w:color w:val="FFFFFF"/>
+                <w:sz w:val="20"/>
+              </w:rPr>
+              <w:t>Problema</w:t>
+            </w:r>
+          </w:p>
+        </w:tc>
+        <w:tc>
+          <w:tcPr>
+            <w:tcW w:type="dxa" w:w="6835"/>
+            <w:shd w:fill="2EC4B6" w:val="clear"/>
+            <w:tcMar>
+              <w:top w:w="60" w:type="dxa"/>
+              <w:bottom w:w="60" w:type="dxa"/>
+              <w:start w:w="100" w:type="dxa"/>
+              <w:end w:w="100" w:type="dxa"/>
+            </w:tcMar>
+          </w:tcPr>
+          <w:p>
+            <w:r/>
+            <w:r>
+              <w:rPr>
+                <w:b/>
+                <w:color w:val="FFFFFF"/>
+                <w:sz w:val="20"/>
+              </w:rPr>
+              <w:t>Qué hacer</w:t>
+            </w:r>
+          </w:p>
+        </w:tc>
+      </w:tr>
+      <w:tr>
+        <w:tc>
+          <w:tcPr>
+            <w:tcW w:type="dxa" w:w="2576"/>
+            <w:tcMar>
+              <w:top w:w="60" w:type="dxa"/>
+              <w:bottom w:w="60" w:type="dxa"/>
+              <w:start w:w="100" w:type="dxa"/>
+              <w:end w:w="100" w:type="dxa"/>
+            </w:tcMar>
+          </w:tcPr>
+          <w:p>
+            <w:r/>
+            <w:r>
+              <w:rPr>
+                <w:sz w:val="20"/>
+              </w:rPr>
+              <w:t>No veo un módulo</w:t>
+            </w:r>
+          </w:p>
+        </w:tc>
+        <w:tc>
+          <w:tcPr>
+            <w:tcW w:type="dxa" w:w="6835"/>
+            <w:tcMar>
+              <w:top w:w="60" w:type="dxa"/>
+              <w:bottom w:w="60" w:type="dxa"/>
+              <w:start w:w="100" w:type="dxa"/>
+              <w:end w:w="100" w:type="dxa"/>
+            </w:tcMar>
+          </w:tcPr>
+          <w:p>
+            <w:r/>
+            <w:r>
+              <w:rPr>
+                <w:sz w:val="20"/>
+              </w:rPr>
+              <w:t>Verifique laboratorio en barra superior y roles en Administración.</w:t>
+            </w:r>
+          </w:p>
+        </w:tc>
+      </w:tr>
+      <w:tr>
+        <w:tc>
+          <w:tcPr>
+            <w:tcW w:type="dxa" w:w="2576"/>
+            <w:shd w:fill="F8FCFB" w:val="clear"/>
+            <w:tcMar>
+              <w:top w:w="60" w:type="dxa"/>
+              <w:bottom w:w="60" w:type="dxa"/>
+              <w:start w:w="100" w:type="dxa"/>
+              <w:end w:w="100" w:type="dxa"/>
+            </w:tcMar>
+          </w:tcPr>
+          <w:p>
+            <w:r/>
+            <w:r>
+              <w:rPr>
+                <w:sz w:val="20"/>
+              </w:rPr>
+              <w:t>Login no guarda sesión (LAN)</w:t>
+            </w:r>
+          </w:p>
+        </w:tc>
+        <w:tc>
+          <w:tcPr>
+            <w:tcW w:type="dxa" w:w="6835"/>
+            <w:shd w:fill="F8FCFB" w:val="clear"/>
+            <w:tcMar>
+              <w:top w:w="60" w:type="dxa"/>
+              <w:bottom w:w="60" w:type="dxa"/>
+              <w:start w:w="100" w:type="dxa"/>
+              <w:end w:w="100" w:type="dxa"/>
+            </w:tcMar>
+          </w:tcPr>
+          <w:p>
+            <w:r/>
+            <w:r>
+              <w:rPr>
+                <w:sz w:val="20"/>
+              </w:rPr>
+              <w:t>Soporte: SESSION_SECURE_COOKIE=false en servidor.</w:t>
+            </w:r>
+          </w:p>
+        </w:tc>
+      </w:tr>
+      <w:tr>
+        <w:tc>
+          <w:tcPr>
+            <w:tcW w:type="dxa" w:w="2576"/>
+            <w:tcMar>
+              <w:top w:w="60" w:type="dxa"/>
+              <w:bottom w:w="60" w:type="dxa"/>
+              <w:start w:w="100" w:type="dxa"/>
+              <w:end w:w="100" w:type="dxa"/>
+            </w:tcMar>
+          </w:tcPr>
+          <w:p>
+            <w:r/>
+            <w:r>
+              <w:rPr>
+                <w:sz w:val="20"/>
+              </w:rPr>
+              <w:t>Visor vacío</w:t>
+            </w:r>
+          </w:p>
+        </w:tc>
+        <w:tc>
+          <w:tcPr>
+            <w:tcW w:type="dxa" w:w="6835"/>
+            <w:tcMar>
+              <w:top w:w="60" w:type="dxa"/>
+              <w:bottom w:w="60" w:type="dxa"/>
+              <w:start w:w="100" w:type="dxa"/>
+              <w:end w:w="100" w:type="dxa"/>
+            </w:tcMar>
+          </w:tcPr>
+          <w:p>
+            <w:r/>
+            <w:r>
+              <w:rPr>
+                <w:sz w:val="20"/>
+              </w:rPr>
+              <w:t>Imágenes aún no en PACS o accession incorrecto; tecnología debe finalizar atención.</w:t>
+            </w:r>
+          </w:p>
+        </w:tc>
+      </w:tr>
+      <w:tr>
+        <w:tc>
+          <w:tcPr>
+            <w:tcW w:type="dxa" w:w="2576"/>
+            <w:shd w:fill="F8FCFB" w:val="clear"/>
+            <w:tcMar>
+              <w:top w:w="60" w:type="dxa"/>
+              <w:bottom w:w="60" w:type="dxa"/>
+              <w:start w:w="100" w:type="dxa"/>
+              <w:end w:w="100" w:type="dxa"/>
+            </w:tcMar>
+          </w:tcPr>
+          <w:p>
+            <w:r/>
+            <w:r>
+              <w:rPr>
+                <w:sz w:val="20"/>
+              </w:rPr>
+              <w:t>Correo no llega al paciente</w:t>
+            </w:r>
+          </w:p>
+        </w:tc>
+        <w:tc>
+          <w:tcPr>
+            <w:tcW w:type="dxa" w:w="6835"/>
+            <w:shd w:fill="F8FCFB" w:val="clear"/>
+            <w:tcMar>
+              <w:top w:w="60" w:type="dxa"/>
+              <w:bottom w:w="60" w:type="dxa"/>
+              <w:start w:w="100" w:type="dxa"/>
+              <w:end w:w="100" w:type="dxa"/>
+            </w:tcMar>
+          </w:tcPr>
+          <w:p>
+            <w:r/>
+            <w:r>
+              <w:rPr>
+                <w:sz w:val="20"/>
+              </w:rPr>
+              <w:t>SMTP del centro o MAIL_MAILER=log en pruebas.</w:t>
+            </w:r>
+          </w:p>
+        </w:tc>
+      </w:tr>
+      <w:tr>
+        <w:tc>
+          <w:tcPr>
+            <w:tcW w:type="dxa" w:w="2576"/>
+            <w:tcMar>
+              <w:top w:w="60" w:type="dxa"/>
+              <w:bottom w:w="60" w:type="dxa"/>
+              <w:start w:w="100" w:type="dxa"/>
+              <w:end w:w="100" w:type="dxa"/>
+            </w:tcMar>
+          </w:tcPr>
+          <w:p>
+            <w:r/>
+            <w:r>
+              <w:rPr>
+                <w:sz w:val="20"/>
+              </w:rPr>
+              <w:t>Colores viejos tras actualizar</w:t>
+            </w:r>
+          </w:p>
+        </w:tc>
+        <w:tc>
+          <w:tcPr>
+            <w:tcW w:type="dxa" w:w="6835"/>
+            <w:tcMar>
+              <w:top w:w="60" w:type="dxa"/>
+              <w:bottom w:w="60" w:type="dxa"/>
+              <w:start w:w="100" w:type="dxa"/>
+              <w:end w:w="100" w:type="dxa"/>
+            </w:tcMar>
+          </w:tcPr>
+          <w:p>
+            <w:r/>
+            <w:r>
+              <w:rPr>
+                <w:sz w:val="20"/>
+              </w:rPr>
+              <w:t>Ctrl+Shift+R o ventana de incógnito en el navegador.</w:t>
+            </w:r>
+          </w:p>
+        </w:tc>
+      </w:tr>
+      <w:tr>
+        <w:tc>
+          <w:tcPr>
+            <w:tcW w:type="dxa" w:w="2576"/>
+            <w:shd w:fill="F8FCFB" w:val="clear"/>
+            <w:tcMar>
+              <w:top w:w="60" w:type="dxa"/>
+              <w:bottom w:w="60" w:type="dxa"/>
+              <w:start w:w="100" w:type="dxa"/>
+              <w:end w:w="100" w:type="dxa"/>
+            </w:tcMar>
+          </w:tcPr>
+          <w:p>
+            <w:r/>
+            <w:r>
+              <w:rPr>
+                <w:sz w:val="20"/>
+              </w:rPr>
+              <w:t>Otra PC no abre el RIS</w:t>
+            </w:r>
+          </w:p>
+        </w:tc>
+        <w:tc>
+          <w:tcPr>
+            <w:tcW w:type="dxa" w:w="6835"/>
+            <w:shd w:fill="F8FCFB" w:val="clear"/>
+            <w:tcMar>
+              <w:top w:w="60" w:type="dxa"/>
+              <w:bottom w:w="60" w:type="dxa"/>
+              <w:start w:w="100" w:type="dxa"/>
+              <w:end w:w="100" w:type="dxa"/>
+            </w:tcMar>
+          </w:tcPr>
+          <w:p>
+            <w:r/>
+            <w:r>
+              <w:rPr>
+                <w:sz w:val="20"/>
+              </w:rPr>
+              <w:t>Use http://IP-del-servidor (no localhost) y misma red Wi‑Fi/LAN.</w:t>
+            </w:r>
+          </w:p>
+        </w:tc>
+      </w:tr>
+    </w:tbl>
+    <w:p>
+      <w:pPr>
+        <w:spacing w:after="160"/>
+      </w:pPr>
+    </w:p>
+    <w:p>
+      <w:r>
+        <w:br w:type="page"/>
+      </w:r>
+    </w:p>
+    <w:p>
+      <w:pPr>
+        <w:pStyle w:val="Heading1"/>
+      </w:pPr>
+      <w:r>
+        <w:t>17. Anexo técnico</w:t>
       </w:r>
     </w:p>
     <w:p>
@@ -6302,7 +7040,7 @@
       <w:rFonts w:asciiTheme="majorHAnsi" w:eastAsiaTheme="majorEastAsia" w:hAnsiTheme="majorHAnsi" w:cstheme="majorBidi" w:ascii="Calibri" w:hAnsi="Calibri"/>
       <w:b/>
       <w:bCs/>
-      <w:color w:val="A894C4"/>
+      <w:color w:val="5B4A82"/>
       <w:sz w:val="36"/>
       <w:szCs w:val="28"/>
     </w:rPr>

</xml_diff>